<commit_message>
Rebuild CV (PDF + DOCX) from latest Google Sheet
</commit_message>
<xml_diff>
--- a/cv_doc.docx
+++ b/cv_doc.docx
@@ -81,7 +81,7 @@
       </w:r>
     </w:p>
     <w:bookmarkEnd w:id="12"/>
-    <w:bookmarkStart w:id="22" w:name="professional-experience"/>
+    <w:bookmarkStart w:id="25" w:name="professional-experience"/>
     <w:p>
       <w:pPr>
         <w:pStyle w:val="Heading2"/>
@@ -90,32 +90,32 @@
         <w:t xml:space="preserve">Professional Experience</w:t>
       </w:r>
     </w:p>
-    <w:bookmarkStart w:id="15" w:name="senior-data-scientist"/>
+    <w:bookmarkStart w:id="15" w:name="nda"/>
     <w:p>
       <w:pPr>
         <w:pStyle w:val="Heading3"/>
       </w:pPr>
       <w:r>
-        <w:t xml:space="preserve">Senior Data Scientist</w:t>
-      </w:r>
-    </w:p>
-    <w:bookmarkStart w:id="13" w:name="grail"/>
+        <w:t xml:space="preserve">NDA</w:t>
+      </w:r>
+    </w:p>
+    <w:bookmarkStart w:id="13" w:name="nda-1"/>
     <w:p>
       <w:pPr>
         <w:pStyle w:val="Heading4"/>
       </w:pPr>
       <w:r>
-        <w:t xml:space="preserve">GRAIL</w:t>
+        <w:t xml:space="preserve">NDA</w:t>
       </w:r>
     </w:p>
     <w:bookmarkEnd w:id="13"/>
-    <w:bookmarkStart w:id="14" w:name="menlo-park-ca"/>
+    <w:bookmarkStart w:id="14" w:name="na"/>
     <w:p>
       <w:pPr>
         <w:pStyle w:val="Heading4"/>
       </w:pPr>
       <w:r>
-        <w:t xml:space="preserve">Menlo Park, CA</w:t>
+        <w:t xml:space="preserve">N/A</w:t>
       </w:r>
     </w:p>
     <w:p>
@@ -123,7 +123,7 @@
         <w:pStyle w:val="FirstParagraph"/>
       </w:pPr>
       <w:r>
-        <w:t xml:space="preserve">February 2021 - August 2024</w:t>
+        <w:t xml:space="preserve">September 2024 - August 2026</w:t>
       </w:r>
     </w:p>
     <w:p>
@@ -135,109 +135,37 @@
         </w:numPr>
       </w:pPr>
       <w:r>
-        <w:t xml:space="preserve">Authored and maintained multiple production R packages used company-wide for clinical trial analysis, validation, and reporting.</w:t>
-      </w:r>
-    </w:p>
-    <w:p>
-      <w:pPr>
-        <w:pStyle w:val="Compact"/>
-        <w:numPr>
-          <w:ilvl w:val="0"/>
-          <w:numId w:val="1001"/>
-        </w:numPr>
-      </w:pPr>
-      <w:r>
-        <w:t xml:space="preserve">Built automated R Markdown pipelines generating hundreds of Tables, Figures, and Listings (TFLs) to support trial accuracy assessments and regulatory reporting.</w:t>
-      </w:r>
-    </w:p>
-    <w:p>
-      <w:pPr>
-        <w:pStyle w:val="Compact"/>
-        <w:numPr>
-          <w:ilvl w:val="0"/>
-          <w:numId w:val="1001"/>
-        </w:numPr>
-      </w:pPr>
-      <w:r>
-        <w:t xml:space="preserve">Developed and documented derived variables under CDISC standards (SDTM, ADaM, CDASH) with Git/GitLab collaboration and AWS S3 data management.</w:t>
-      </w:r>
-    </w:p>
-    <w:p>
-      <w:pPr>
-        <w:pStyle w:val="Compact"/>
-        <w:numPr>
-          <w:ilvl w:val="0"/>
-          <w:numId w:val="1001"/>
-        </w:numPr>
-      </w:pPr>
-      <w:r>
-        <w:t xml:space="preserve">Created an R Shiny app to visualize cancer screening timelines and key events leading to diagnosis.</w:t>
-      </w:r>
-    </w:p>
-    <w:p>
-      <w:pPr>
-        <w:pStyle w:val="Compact"/>
-        <w:numPr>
-          <w:ilvl w:val="0"/>
-          <w:numId w:val="1001"/>
-        </w:numPr>
-      </w:pPr>
-      <w:r>
-        <w:t xml:space="preserve">Provided statistical programming support for data cleaning, database locks, SAP-driven analyses, and exploratory investigations.</w:t>
-      </w:r>
-    </w:p>
-    <w:p>
-      <w:pPr>
-        <w:pStyle w:val="Compact"/>
-        <w:numPr>
-          <w:ilvl w:val="0"/>
-          <w:numId w:val="1001"/>
-        </w:numPr>
-      </w:pPr>
-      <w:r>
-        <w:t xml:space="preserve">Partnered with biostatisticians to translate SAPs into analysis specifications and reusable code.</w:t>
-      </w:r>
-    </w:p>
-    <w:p>
-      <w:pPr>
-        <w:pStyle w:val="Compact"/>
-        <w:numPr>
-          <w:ilvl w:val="0"/>
-          <w:numId w:val="1001"/>
-        </w:numPr>
-      </w:pPr>
-      <w:r>
-        <w:t xml:space="preserve">Built reproducible pipelines with unit tests and a shared code library to ensure audit-ready, backward-compatible outputs.</w:t>
+        <w:t xml:space="preserve">Biotech R Programming Consultant</w:t>
       </w:r>
     </w:p>
     <w:bookmarkEnd w:id="14"/>
     <w:bookmarkEnd w:id="15"/>
-    <w:bookmarkStart w:id="18" w:name="reporting-analyst"/>
+    <w:bookmarkStart w:id="18" w:name="senior-data-scientist"/>
     <w:p>
       <w:pPr>
         <w:pStyle w:val="Heading3"/>
       </w:pPr>
       <w:r>
-        <w:t xml:space="preserve">Reporting Analyst</w:t>
-      </w:r>
-    </w:p>
-    <w:bookmarkStart w:id="16" w:name="hour-home-care"/>
+        <w:t xml:space="preserve">Senior Data Scientist</w:t>
+      </w:r>
+    </w:p>
+    <w:bookmarkStart w:id="16" w:name="grail"/>
     <w:p>
       <w:pPr>
         <w:pStyle w:val="Heading4"/>
       </w:pPr>
       <w:r>
-        <w:t xml:space="preserve">24 Hour Home Care</w:t>
+        <w:t xml:space="preserve">GRAIL</w:t>
       </w:r>
     </w:p>
     <w:bookmarkEnd w:id="16"/>
-    <w:bookmarkStart w:id="17" w:name="el-segundo-ca"/>
+    <w:bookmarkStart w:id="17" w:name="menlo-park-ca"/>
     <w:p>
       <w:pPr>
         <w:pStyle w:val="Heading4"/>
       </w:pPr>
       <w:r>
-        <w:t xml:space="preserve">El Segundo, CA</w:t>
+        <w:t xml:space="preserve">Menlo Park, CA</w:t>
       </w:r>
     </w:p>
     <w:p>
@@ -245,7 +173,7 @@
         <w:pStyle w:val="FirstParagraph"/>
       </w:pPr>
       <w:r>
-        <w:t xml:space="preserve">April 2020 - January 2021</w:t>
+        <w:t xml:space="preserve">February 2021 - August 2024</w:t>
       </w:r>
     </w:p>
     <w:p>
@@ -257,7 +185,7 @@
         </w:numPr>
       </w:pPr>
       <w:r>
-        <w:t xml:space="preserve">Automated weekly accounts receivable aging report in R with HTML/CSS email delivery, saving ~5 hours per week.</w:t>
+        <w:t xml:space="preserve">Authored and maintained multiple production R packages used company-wide for clinical trial analysis, validation, and reporting.</w:t>
       </w:r>
     </w:p>
     <w:p>
@@ -269,7 +197,7 @@
         </w:numPr>
       </w:pPr>
       <w:r>
-        <w:t xml:space="preserve">Built ad hoc dashboards and data visualizations to support leadership requests.</w:t>
+        <w:t xml:space="preserve">Built automated R Markdown pipelines generating hundreds of Tables, Figures, and Listings (TFLs) to support trial accuracy assessments and regulatory reporting.</w:t>
       </w:r>
     </w:p>
     <w:p>
@@ -281,7 +209,7 @@
         </w:numPr>
       </w:pPr>
       <w:r>
-        <w:t xml:space="preserve">Served as analytics liaison across teams to align reporting needs and delivery.</w:t>
+        <w:t xml:space="preserve">Developed and documented derived variables under CDISC standards (SDTM, ADaM, CDASH) with Git/GitLab collaboration and AWS S3 data management.</w:t>
       </w:r>
     </w:p>
     <w:p>
@@ -293,37 +221,73 @@
         </w:numPr>
       </w:pPr>
       <w:r>
-        <w:t xml:space="preserve">Automated batch invoice emails and Azure Web App exports, reducing manual effort across teams.</w:t>
+        <w:t xml:space="preserve">Created an R Shiny app to visualize cancer screening timelines and key events leading to diagnosis.</w:t>
+      </w:r>
+    </w:p>
+    <w:p>
+      <w:pPr>
+        <w:pStyle w:val="Compact"/>
+        <w:numPr>
+          <w:ilvl w:val="0"/>
+          <w:numId w:val="1002"/>
+        </w:numPr>
+      </w:pPr>
+      <w:r>
+        <w:t xml:space="preserve">Provided statistical programming support for data cleaning, database locks, SAP-driven analyses, and exploratory investigations.</w:t>
+      </w:r>
+    </w:p>
+    <w:p>
+      <w:pPr>
+        <w:pStyle w:val="Compact"/>
+        <w:numPr>
+          <w:ilvl w:val="0"/>
+          <w:numId w:val="1002"/>
+        </w:numPr>
+      </w:pPr>
+      <w:r>
+        <w:t xml:space="preserve">Partnered with biostatisticians to translate SAPs into analysis specifications and reusable code.</w:t>
+      </w:r>
+    </w:p>
+    <w:p>
+      <w:pPr>
+        <w:pStyle w:val="Compact"/>
+        <w:numPr>
+          <w:ilvl w:val="0"/>
+          <w:numId w:val="1002"/>
+        </w:numPr>
+      </w:pPr>
+      <w:r>
+        <w:t xml:space="preserve">Built reproducible pipelines with unit tests and a shared code library to ensure audit-ready, backward-compatible outputs.</w:t>
       </w:r>
     </w:p>
     <w:bookmarkEnd w:id="17"/>
     <w:bookmarkEnd w:id="18"/>
-    <w:bookmarkStart w:id="21" w:name="actuarial-analyst"/>
+    <w:bookmarkStart w:id="21" w:name="reporting-analyst"/>
     <w:p>
       <w:pPr>
         <w:pStyle w:val="Heading3"/>
       </w:pPr>
       <w:r>
-        <w:t xml:space="preserve">Actuarial Analyst</w:t>
-      </w:r>
-    </w:p>
-    <w:bookmarkStart w:id="19" w:name="hmsa"/>
+        <w:t xml:space="preserve">Reporting Analyst</w:t>
+      </w:r>
+    </w:p>
+    <w:bookmarkStart w:id="19" w:name="hour-home-care"/>
     <w:p>
       <w:pPr>
         <w:pStyle w:val="Heading4"/>
       </w:pPr>
       <w:r>
-        <w:t xml:space="preserve">HMSA</w:t>
+        <w:t xml:space="preserve">24 Hour Home Care</w:t>
       </w:r>
     </w:p>
     <w:bookmarkEnd w:id="19"/>
-    <w:bookmarkStart w:id="20" w:name="honolulu-hi"/>
+    <w:bookmarkStart w:id="20" w:name="el-segundo-ca"/>
     <w:p>
       <w:pPr>
         <w:pStyle w:val="Heading4"/>
       </w:pPr>
       <w:r>
-        <w:t xml:space="preserve">Honolulu, HI</w:t>
+        <w:t xml:space="preserve">El Segundo, CA</w:t>
       </w:r>
     </w:p>
     <w:p>
@@ -331,7 +295,7 @@
         <w:pStyle w:val="FirstParagraph"/>
       </w:pPr>
       <w:r>
-        <w:t xml:space="preserve">January 2019 - March 2020</w:t>
+        <w:t xml:space="preserve">April 2020 - January 2021</w:t>
       </w:r>
     </w:p>
     <w:p>
@@ -343,7 +307,7 @@
         </w:numPr>
       </w:pPr>
       <w:r>
-        <w:t xml:space="preserve">Automated CRG band renewal in R, reducing runtime from 8 hours to under 1 minute.</w:t>
+        <w:t xml:space="preserve">Automated weekly accounts receivable aging report in R with HTML/CSS email delivery, saving ~5 hours per week.</w:t>
       </w:r>
     </w:p>
     <w:p>
@@ -355,7 +319,7 @@
         </w:numPr>
       </w:pPr>
       <w:r>
-        <w:t xml:space="preserve">Automated demographic and plan risk factor workflows and forecasting models with Excel/R integration.</w:t>
+        <w:t xml:space="preserve">Built ad hoc dashboards and data visualizations to support leadership requests.</w:t>
       </w:r>
     </w:p>
     <w:p>
@@ -367,7 +331,7 @@
         </w:numPr>
       </w:pPr>
       <w:r>
-        <w:t xml:space="preserve">Automated CRG proposal and mental health parity processes; documented methods and led stakeholder walkthroughs.</w:t>
+        <w:t xml:space="preserve">Served as analytics liaison across teams to align reporting needs and delivery.</w:t>
       </w:r>
     </w:p>
     <w:p>
@@ -379,47 +343,37 @@
         </w:numPr>
       </w:pPr>
       <w:r>
-        <w:t xml:space="preserve">Fit empirical distributions using KS tests and MLE for actuarial modeling.</w:t>
+        <w:t xml:space="preserve">Automated batch invoice emails and Azure Web App exports, reducing manual effort across teams.</w:t>
       </w:r>
     </w:p>
     <w:bookmarkEnd w:id="20"/>
     <w:bookmarkEnd w:id="21"/>
+    <w:bookmarkStart w:id="24" w:name="actuarial-analyst"/>
+    <w:p>
+      <w:pPr>
+        <w:pStyle w:val="Heading3"/>
+      </w:pPr>
+      <w:r>
+        <w:t xml:space="preserve">Actuarial Analyst</w:t>
+      </w:r>
+    </w:p>
+    <w:bookmarkStart w:id="22" w:name="hmsa"/>
+    <w:p>
+      <w:pPr>
+        <w:pStyle w:val="Heading4"/>
+      </w:pPr>
+      <w:r>
+        <w:t xml:space="preserve">HMSA</w:t>
+      </w:r>
+    </w:p>
     <w:bookmarkEnd w:id="22"/>
-    <w:bookmarkStart w:id="26" w:name="education"/>
-    <w:p>
-      <w:pPr>
-        <w:pStyle w:val="Heading2"/>
-      </w:pPr>
-      <w:r>
-        <w:t xml:space="preserve">Education</w:t>
-      </w:r>
-    </w:p>
-    <w:bookmarkStart w:id="25" w:name="bachelor-of-science"/>
-    <w:p>
-      <w:pPr>
-        <w:pStyle w:val="Heading3"/>
-      </w:pPr>
-      <w:r>
-        <w:t xml:space="preserve">Bachelor of Science</w:t>
-      </w:r>
-    </w:p>
-    <w:bookmarkStart w:id="23" w:name="university-of-california-irvine"/>
+    <w:bookmarkStart w:id="23" w:name="honolulu-hi"/>
     <w:p>
       <w:pPr>
         <w:pStyle w:val="Heading4"/>
       </w:pPr>
       <w:r>
-        <w:t xml:space="preserve">University of California, Irvine</w:t>
-      </w:r>
-    </w:p>
-    <w:bookmarkEnd w:id="23"/>
-    <w:bookmarkStart w:id="24" w:name="irvine-ca"/>
-    <w:p>
-      <w:pPr>
-        <w:pStyle w:val="Heading4"/>
-      </w:pPr>
-      <w:r>
-        <w:t xml:space="preserve">Irvine, CA</w:t>
+        <w:t xml:space="preserve">Honolulu, HI</w:t>
       </w:r>
     </w:p>
     <w:p>
@@ -427,7 +381,7 @@
         <w:pStyle w:val="FirstParagraph"/>
       </w:pPr>
       <w:r>
-        <w:t xml:space="preserve">2018</w:t>
+        <w:t xml:space="preserve">January 2019 - March 2020</w:t>
       </w:r>
     </w:p>
     <w:p>
@@ -439,7 +393,7 @@
         </w:numPr>
       </w:pPr>
       <w:r>
-        <w:t xml:space="preserve">Major in Mathematics</w:t>
+        <w:t xml:space="preserve">Automated CRG band renewal in R, reducing runtime from 8 hours to under 1 minute.</w:t>
       </w:r>
     </w:p>
     <w:p>
@@ -451,13 +405,109 @@
         </w:numPr>
       </w:pPr>
       <w:r>
-        <w:t xml:space="preserve">Minor in Statistics</w:t>
-      </w:r>
-    </w:p>
+        <w:t xml:space="preserve">Automated demographic and plan risk factor workflows and forecasting models with Excel/R integration.</w:t>
+      </w:r>
+    </w:p>
+    <w:p>
+      <w:pPr>
+        <w:pStyle w:val="Compact"/>
+        <w:numPr>
+          <w:ilvl w:val="0"/>
+          <w:numId w:val="1004"/>
+        </w:numPr>
+      </w:pPr>
+      <w:r>
+        <w:t xml:space="preserve">Automated CRG proposal and mental health parity processes; documented methods and led stakeholder walkthroughs.</w:t>
+      </w:r>
+    </w:p>
+    <w:p>
+      <w:pPr>
+        <w:pStyle w:val="Compact"/>
+        <w:numPr>
+          <w:ilvl w:val="0"/>
+          <w:numId w:val="1004"/>
+        </w:numPr>
+      </w:pPr>
+      <w:r>
+        <w:t xml:space="preserve">Fit empirical distributions using KS tests and MLE for actuarial modeling.</w:t>
+      </w:r>
+    </w:p>
+    <w:bookmarkEnd w:id="23"/>
     <w:bookmarkEnd w:id="24"/>
     <w:bookmarkEnd w:id="25"/>
+    <w:bookmarkStart w:id="29" w:name="education"/>
+    <w:p>
+      <w:pPr>
+        <w:pStyle w:val="Heading2"/>
+      </w:pPr>
+      <w:r>
+        <w:t xml:space="preserve">Education</w:t>
+      </w:r>
+    </w:p>
+    <w:bookmarkStart w:id="28" w:name="bachelor-of-science"/>
+    <w:p>
+      <w:pPr>
+        <w:pStyle w:val="Heading3"/>
+      </w:pPr>
+      <w:r>
+        <w:t xml:space="preserve">Bachelor of Science</w:t>
+      </w:r>
+    </w:p>
+    <w:bookmarkStart w:id="26" w:name="university-of-california-irvine"/>
+    <w:p>
+      <w:pPr>
+        <w:pStyle w:val="Heading4"/>
+      </w:pPr>
+      <w:r>
+        <w:t xml:space="preserve">University of California, Irvine</w:t>
+      </w:r>
+    </w:p>
     <w:bookmarkEnd w:id="26"/>
-    <w:bookmarkStart w:id="30" w:name="awards"/>
+    <w:bookmarkStart w:id="27" w:name="irvine-ca"/>
+    <w:p>
+      <w:pPr>
+        <w:pStyle w:val="Heading4"/>
+      </w:pPr>
+      <w:r>
+        <w:t xml:space="preserve">Irvine, CA</w:t>
+      </w:r>
+    </w:p>
+    <w:p>
+      <w:pPr>
+        <w:pStyle w:val="FirstParagraph"/>
+      </w:pPr>
+      <w:r>
+        <w:t xml:space="preserve">2018</w:t>
+      </w:r>
+    </w:p>
+    <w:p>
+      <w:pPr>
+        <w:pStyle w:val="Compact"/>
+        <w:numPr>
+          <w:ilvl w:val="0"/>
+          <w:numId w:val="1005"/>
+        </w:numPr>
+      </w:pPr>
+      <w:r>
+        <w:t xml:space="preserve">Major in Mathematics</w:t>
+      </w:r>
+    </w:p>
+    <w:p>
+      <w:pPr>
+        <w:pStyle w:val="Compact"/>
+        <w:numPr>
+          <w:ilvl w:val="0"/>
+          <w:numId w:val="1005"/>
+        </w:numPr>
+      </w:pPr>
+      <w:r>
+        <w:t xml:space="preserve">Minor in Statistics</w:t>
+      </w:r>
+    </w:p>
+    <w:bookmarkEnd w:id="27"/>
+    <w:bookmarkEnd w:id="28"/>
+    <w:bookmarkEnd w:id="29"/>
+    <w:bookmarkStart w:id="33" w:name="awards"/>
     <w:p>
       <w:pPr>
         <w:pStyle w:val="Heading2"/>
@@ -466,7 +516,7 @@
         <w:t xml:space="preserve">Awards</w:t>
       </w:r>
     </w:p>
-    <w:bookmarkStart w:id="29" w:name="X2250b0ba64101f53b5fdfff6ab9a85e023ab2b4"/>
+    <w:bookmarkStart w:id="32" w:name="X2250b0ba64101f53b5fdfff6ab9a85e023ab2b4"/>
     <w:p>
       <w:pPr>
         <w:pStyle w:val="Heading3"/>
@@ -474,7 +524,7 @@
       <w:r>
         <w:t xml:space="preserve">BAS UCLA Case Competition Finalist (</w:t>
       </w:r>
-      <w:hyperlink r:id="rId27">
+      <w:hyperlink r:id="rId30">
         <w:r>
           <w:rPr>
             <w:rStyle w:val="Hyperlink"/>
@@ -491,7 +541,7 @@
       <w:r>
         <w:t xml:space="preserve"> </w:t>
       </w:r>
-      <w:hyperlink r:id="rId28">
+      <w:hyperlink r:id="rId31">
         <w:r>
           <w:rPr>
             <w:rStyle w:val="Hyperlink"/>
@@ -503,9 +553,9 @@
         <w:t xml:space="preserve">)</w:t>
       </w:r>
     </w:p>
-    <w:bookmarkEnd w:id="29"/>
-    <w:bookmarkEnd w:id="30"/>
-    <w:bookmarkStart w:id="32" w:name="credentials"/>
+    <w:bookmarkEnd w:id="32"/>
+    <w:bookmarkEnd w:id="33"/>
+    <w:bookmarkStart w:id="35" w:name="credentials"/>
     <w:p>
       <w:pPr>
         <w:pStyle w:val="Heading2"/>
@@ -514,7 +564,7 @@
         <w:t xml:space="preserve">Credentials</w:t>
       </w:r>
     </w:p>
-    <w:bookmarkStart w:id="31" w:name="passed-3-actuarial-exams-exam-p-fm-srm"/>
+    <w:bookmarkStart w:id="34" w:name="passed-3-actuarial-exams-exam-p-fm-srm"/>
     <w:p>
       <w:pPr>
         <w:pStyle w:val="Heading3"/>
@@ -523,9 +573,9 @@
         <w:t xml:space="preserve">Passed 3 Actuarial Exams (Exam P, FM, SRM)</w:t>
       </w:r>
     </w:p>
-    <w:bookmarkEnd w:id="31"/>
-    <w:bookmarkEnd w:id="32"/>
-    <w:bookmarkStart w:id="33" w:name="skills"/>
+    <w:bookmarkEnd w:id="34"/>
+    <w:bookmarkEnd w:id="35"/>
+    <w:bookmarkStart w:id="36" w:name="skills"/>
     <w:p>
       <w:pPr>
         <w:pStyle w:val="Heading2"/>
@@ -538,7 +588,7 @@
       <w:pPr>
         <w:numPr>
           <w:ilvl w:val="0"/>
-          <w:numId w:val="1005"/>
+          <w:numId w:val="1006"/>
         </w:numPr>
       </w:pPr>
       <w:r>
@@ -549,7 +599,7 @@
       <w:pPr>
         <w:numPr>
           <w:ilvl w:val="0"/>
-          <w:numId w:val="1005"/>
+          <w:numId w:val="1006"/>
         </w:numPr>
       </w:pPr>
       <w:r>
@@ -560,7 +610,7 @@
       <w:pPr>
         <w:numPr>
           <w:ilvl w:val="0"/>
-          <w:numId w:val="1005"/>
+          <w:numId w:val="1006"/>
         </w:numPr>
       </w:pPr>
       <w:r>
@@ -571,7 +621,7 @@
       <w:pPr>
         <w:numPr>
           <w:ilvl w:val="0"/>
-          <w:numId w:val="1005"/>
+          <w:numId w:val="1006"/>
         </w:numPr>
       </w:pPr>
       <w:r>
@@ -582,14 +632,14 @@
       <w:pPr>
         <w:numPr>
           <w:ilvl w:val="0"/>
-          <w:numId w:val="1005"/>
+          <w:numId w:val="1006"/>
         </w:numPr>
       </w:pPr>
       <w:r>
         <w:t xml:space="preserve">Excel: Advanced formulas, automation, VBA</w:t>
       </w:r>
     </w:p>
-    <w:bookmarkEnd w:id="33"/>
+    <w:bookmarkEnd w:id="36"/>
     <w:sectPr>
       <w:pgSz w:h="15840" w:w="12240"/>
       <w:pgMar w:bottom="423" w:footer="720" w:gutter="0" w:header="720" w:left="1440" w:right="1440" w:top="1134"/>
@@ -2453,6 +2503,9 @@
     <w:abstractNumId w:val="991"/>
   </w:num>
   <w:num w:numId="1005">
+    <w:abstractNumId w:val="991"/>
+  </w:num>
+  <w:num w:numId="1006">
     <w:abstractNumId w:val="991"/>
   </w:num>
 </w:numbering>

</xml_diff>

<commit_message>
Rebuild CV (PDF + DOCX) from latest Google Sheet (#185)
Co-authored-by: cavandonohoe <59952579+cavandonohoe@users.noreply.github.com>
</commit_message>
<xml_diff>
--- a/cv_doc.docx
+++ b/cv_doc.docx
@@ -81,7 +81,7 @@
       </w:r>
     </w:p>
     <w:bookmarkEnd w:id="12"/>
-    <w:bookmarkStart w:id="22" w:name="professional-experience"/>
+    <w:bookmarkStart w:id="25" w:name="professional-experience"/>
     <w:p>
       <w:pPr>
         <w:pStyle w:val="Heading2"/>
@@ -90,32 +90,32 @@
         <w:t xml:space="preserve">Professional Experience</w:t>
       </w:r>
     </w:p>
-    <w:bookmarkStart w:id="15" w:name="senior-data-scientist"/>
+    <w:bookmarkStart w:id="15" w:name="nda"/>
     <w:p>
       <w:pPr>
         <w:pStyle w:val="Heading3"/>
       </w:pPr>
       <w:r>
-        <w:t xml:space="preserve">Senior Data Scientist</w:t>
-      </w:r>
-    </w:p>
-    <w:bookmarkStart w:id="13" w:name="grail"/>
+        <w:t xml:space="preserve">NDA</w:t>
+      </w:r>
+    </w:p>
+    <w:bookmarkStart w:id="13" w:name="nda-1"/>
     <w:p>
       <w:pPr>
         <w:pStyle w:val="Heading4"/>
       </w:pPr>
       <w:r>
-        <w:t xml:space="preserve">GRAIL</w:t>
+        <w:t xml:space="preserve">NDA</w:t>
       </w:r>
     </w:p>
     <w:bookmarkEnd w:id="13"/>
-    <w:bookmarkStart w:id="14" w:name="menlo-park-ca"/>
+    <w:bookmarkStart w:id="14" w:name="na"/>
     <w:p>
       <w:pPr>
         <w:pStyle w:val="Heading4"/>
       </w:pPr>
       <w:r>
-        <w:t xml:space="preserve">Menlo Park, CA</w:t>
+        <w:t xml:space="preserve">N/A</w:t>
       </w:r>
     </w:p>
     <w:p>
@@ -123,7 +123,7 @@
         <w:pStyle w:val="FirstParagraph"/>
       </w:pPr>
       <w:r>
-        <w:t xml:space="preserve">February 2021 - August 2024</w:t>
+        <w:t xml:space="preserve">September 2024 - August 2026</w:t>
       </w:r>
     </w:p>
     <w:p>
@@ -135,109 +135,37 @@
         </w:numPr>
       </w:pPr>
       <w:r>
-        <w:t xml:space="preserve">Authored and maintained multiple production R packages used company-wide for clinical trial analysis, validation, and reporting.</w:t>
-      </w:r>
-    </w:p>
-    <w:p>
-      <w:pPr>
-        <w:pStyle w:val="Compact"/>
-        <w:numPr>
-          <w:ilvl w:val="0"/>
-          <w:numId w:val="1001"/>
-        </w:numPr>
-      </w:pPr>
-      <w:r>
-        <w:t xml:space="preserve">Built automated R Markdown pipelines generating hundreds of Tables, Figures, and Listings (TFLs) to support trial accuracy assessments and regulatory reporting.</w:t>
-      </w:r>
-    </w:p>
-    <w:p>
-      <w:pPr>
-        <w:pStyle w:val="Compact"/>
-        <w:numPr>
-          <w:ilvl w:val="0"/>
-          <w:numId w:val="1001"/>
-        </w:numPr>
-      </w:pPr>
-      <w:r>
-        <w:t xml:space="preserve">Developed and documented derived variables under CDISC standards (SDTM, ADaM, CDASH) with Git/GitLab collaboration and AWS S3 data management.</w:t>
-      </w:r>
-    </w:p>
-    <w:p>
-      <w:pPr>
-        <w:pStyle w:val="Compact"/>
-        <w:numPr>
-          <w:ilvl w:val="0"/>
-          <w:numId w:val="1001"/>
-        </w:numPr>
-      </w:pPr>
-      <w:r>
-        <w:t xml:space="preserve">Created an R Shiny app to visualize cancer screening timelines and key events leading to diagnosis.</w:t>
-      </w:r>
-    </w:p>
-    <w:p>
-      <w:pPr>
-        <w:pStyle w:val="Compact"/>
-        <w:numPr>
-          <w:ilvl w:val="0"/>
-          <w:numId w:val="1001"/>
-        </w:numPr>
-      </w:pPr>
-      <w:r>
-        <w:t xml:space="preserve">Provided statistical programming support for data cleaning, database locks, SAP-driven analyses, and exploratory investigations.</w:t>
-      </w:r>
-    </w:p>
-    <w:p>
-      <w:pPr>
-        <w:pStyle w:val="Compact"/>
-        <w:numPr>
-          <w:ilvl w:val="0"/>
-          <w:numId w:val="1001"/>
-        </w:numPr>
-      </w:pPr>
-      <w:r>
-        <w:t xml:space="preserve">Partnered with biostatisticians to translate SAPs into analysis specifications and reusable code.</w:t>
-      </w:r>
-    </w:p>
-    <w:p>
-      <w:pPr>
-        <w:pStyle w:val="Compact"/>
-        <w:numPr>
-          <w:ilvl w:val="0"/>
-          <w:numId w:val="1001"/>
-        </w:numPr>
-      </w:pPr>
-      <w:r>
-        <w:t xml:space="preserve">Built reproducible pipelines with unit tests and a shared code library to ensure audit-ready, backward-compatible outputs.</w:t>
+        <w:t xml:space="preserve">Biotech R Programming Consultant</w:t>
       </w:r>
     </w:p>
     <w:bookmarkEnd w:id="14"/>
     <w:bookmarkEnd w:id="15"/>
-    <w:bookmarkStart w:id="18" w:name="reporting-analyst"/>
+    <w:bookmarkStart w:id="18" w:name="senior-data-scientist"/>
     <w:p>
       <w:pPr>
         <w:pStyle w:val="Heading3"/>
       </w:pPr>
       <w:r>
-        <w:t xml:space="preserve">Reporting Analyst</w:t>
-      </w:r>
-    </w:p>
-    <w:bookmarkStart w:id="16" w:name="hour-home-care"/>
+        <w:t xml:space="preserve">Senior Data Scientist</w:t>
+      </w:r>
+    </w:p>
+    <w:bookmarkStart w:id="16" w:name="grail"/>
     <w:p>
       <w:pPr>
         <w:pStyle w:val="Heading4"/>
       </w:pPr>
       <w:r>
-        <w:t xml:space="preserve">24 Hour Home Care</w:t>
+        <w:t xml:space="preserve">GRAIL</w:t>
       </w:r>
     </w:p>
     <w:bookmarkEnd w:id="16"/>
-    <w:bookmarkStart w:id="17" w:name="el-segundo-ca"/>
+    <w:bookmarkStart w:id="17" w:name="menlo-park-ca"/>
     <w:p>
       <w:pPr>
         <w:pStyle w:val="Heading4"/>
       </w:pPr>
       <w:r>
-        <w:t xml:space="preserve">El Segundo, CA</w:t>
+        <w:t xml:space="preserve">Menlo Park, CA</w:t>
       </w:r>
     </w:p>
     <w:p>
@@ -245,7 +173,7 @@
         <w:pStyle w:val="FirstParagraph"/>
       </w:pPr>
       <w:r>
-        <w:t xml:space="preserve">April 2020 - January 2021</w:t>
+        <w:t xml:space="preserve">February 2021 - August 2024</w:t>
       </w:r>
     </w:p>
     <w:p>
@@ -257,7 +185,7 @@
         </w:numPr>
       </w:pPr>
       <w:r>
-        <w:t xml:space="preserve">Automated weekly accounts receivable aging report in R with HTML/CSS email delivery, saving ~5 hours per week.</w:t>
+        <w:t xml:space="preserve">Authored and maintained multiple production R packages used company-wide for clinical trial analysis, validation, and reporting.</w:t>
       </w:r>
     </w:p>
     <w:p>
@@ -269,7 +197,7 @@
         </w:numPr>
       </w:pPr>
       <w:r>
-        <w:t xml:space="preserve">Built ad hoc dashboards and data visualizations to support leadership requests.</w:t>
+        <w:t xml:space="preserve">Built automated R Markdown pipelines generating hundreds of Tables, Figures, and Listings (TFLs) to support trial accuracy assessments and regulatory reporting.</w:t>
       </w:r>
     </w:p>
     <w:p>
@@ -281,7 +209,7 @@
         </w:numPr>
       </w:pPr>
       <w:r>
-        <w:t xml:space="preserve">Served as analytics liaison across teams to align reporting needs and delivery.</w:t>
+        <w:t xml:space="preserve">Developed and documented derived variables under CDISC standards (SDTM, ADaM, CDASH) with Git/GitLab collaboration and AWS S3 data management.</w:t>
       </w:r>
     </w:p>
     <w:p>
@@ -293,37 +221,73 @@
         </w:numPr>
       </w:pPr>
       <w:r>
-        <w:t xml:space="preserve">Automated batch invoice emails and Azure Web App exports, reducing manual effort across teams.</w:t>
+        <w:t xml:space="preserve">Created an R Shiny app to visualize cancer screening timelines and key events leading to diagnosis.</w:t>
+      </w:r>
+    </w:p>
+    <w:p>
+      <w:pPr>
+        <w:pStyle w:val="Compact"/>
+        <w:numPr>
+          <w:ilvl w:val="0"/>
+          <w:numId w:val="1002"/>
+        </w:numPr>
+      </w:pPr>
+      <w:r>
+        <w:t xml:space="preserve">Provided statistical programming support for data cleaning, database locks, SAP-driven analyses, and exploratory investigations.</w:t>
+      </w:r>
+    </w:p>
+    <w:p>
+      <w:pPr>
+        <w:pStyle w:val="Compact"/>
+        <w:numPr>
+          <w:ilvl w:val="0"/>
+          <w:numId w:val="1002"/>
+        </w:numPr>
+      </w:pPr>
+      <w:r>
+        <w:t xml:space="preserve">Partnered with biostatisticians to translate SAPs into analysis specifications and reusable code.</w:t>
+      </w:r>
+    </w:p>
+    <w:p>
+      <w:pPr>
+        <w:pStyle w:val="Compact"/>
+        <w:numPr>
+          <w:ilvl w:val="0"/>
+          <w:numId w:val="1002"/>
+        </w:numPr>
+      </w:pPr>
+      <w:r>
+        <w:t xml:space="preserve">Built reproducible pipelines with unit tests and a shared code library to ensure audit-ready, backward-compatible outputs.</w:t>
       </w:r>
     </w:p>
     <w:bookmarkEnd w:id="17"/>
     <w:bookmarkEnd w:id="18"/>
-    <w:bookmarkStart w:id="21" w:name="actuarial-analyst"/>
+    <w:bookmarkStart w:id="21" w:name="reporting-analyst"/>
     <w:p>
       <w:pPr>
         <w:pStyle w:val="Heading3"/>
       </w:pPr>
       <w:r>
-        <w:t xml:space="preserve">Actuarial Analyst</w:t>
-      </w:r>
-    </w:p>
-    <w:bookmarkStart w:id="19" w:name="hmsa"/>
+        <w:t xml:space="preserve">Reporting Analyst</w:t>
+      </w:r>
+    </w:p>
+    <w:bookmarkStart w:id="19" w:name="hour-home-care"/>
     <w:p>
       <w:pPr>
         <w:pStyle w:val="Heading4"/>
       </w:pPr>
       <w:r>
-        <w:t xml:space="preserve">HMSA</w:t>
+        <w:t xml:space="preserve">24 Hour Home Care</w:t>
       </w:r>
     </w:p>
     <w:bookmarkEnd w:id="19"/>
-    <w:bookmarkStart w:id="20" w:name="honolulu-hi"/>
+    <w:bookmarkStart w:id="20" w:name="el-segundo-ca"/>
     <w:p>
       <w:pPr>
         <w:pStyle w:val="Heading4"/>
       </w:pPr>
       <w:r>
-        <w:t xml:space="preserve">Honolulu, HI</w:t>
+        <w:t xml:space="preserve">El Segundo, CA</w:t>
       </w:r>
     </w:p>
     <w:p>
@@ -331,7 +295,7 @@
         <w:pStyle w:val="FirstParagraph"/>
       </w:pPr>
       <w:r>
-        <w:t xml:space="preserve">January 2019 - March 2020</w:t>
+        <w:t xml:space="preserve">April 2020 - January 2021</w:t>
       </w:r>
     </w:p>
     <w:p>
@@ -343,7 +307,7 @@
         </w:numPr>
       </w:pPr>
       <w:r>
-        <w:t xml:space="preserve">Automated CRG band renewal in R, reducing runtime from 8 hours to under 1 minute.</w:t>
+        <w:t xml:space="preserve">Automated weekly accounts receivable aging report in R with HTML/CSS email delivery, saving ~5 hours per week.</w:t>
       </w:r>
     </w:p>
     <w:p>
@@ -355,7 +319,7 @@
         </w:numPr>
       </w:pPr>
       <w:r>
-        <w:t xml:space="preserve">Automated demographic and plan risk factor workflows and forecasting models with Excel/R integration.</w:t>
+        <w:t xml:space="preserve">Built ad hoc dashboards and data visualizations to support leadership requests.</w:t>
       </w:r>
     </w:p>
     <w:p>
@@ -367,7 +331,7 @@
         </w:numPr>
       </w:pPr>
       <w:r>
-        <w:t xml:space="preserve">Automated CRG proposal and mental health parity processes; documented methods and led stakeholder walkthroughs.</w:t>
+        <w:t xml:space="preserve">Served as analytics liaison across teams to align reporting needs and delivery.</w:t>
       </w:r>
     </w:p>
     <w:p>
@@ -379,47 +343,37 @@
         </w:numPr>
       </w:pPr>
       <w:r>
-        <w:t xml:space="preserve">Fit empirical distributions using KS tests and MLE for actuarial modeling.</w:t>
+        <w:t xml:space="preserve">Automated batch invoice emails and Azure Web App exports, reducing manual effort across teams.</w:t>
       </w:r>
     </w:p>
     <w:bookmarkEnd w:id="20"/>
     <w:bookmarkEnd w:id="21"/>
+    <w:bookmarkStart w:id="24" w:name="actuarial-analyst"/>
+    <w:p>
+      <w:pPr>
+        <w:pStyle w:val="Heading3"/>
+      </w:pPr>
+      <w:r>
+        <w:t xml:space="preserve">Actuarial Analyst</w:t>
+      </w:r>
+    </w:p>
+    <w:bookmarkStart w:id="22" w:name="hmsa"/>
+    <w:p>
+      <w:pPr>
+        <w:pStyle w:val="Heading4"/>
+      </w:pPr>
+      <w:r>
+        <w:t xml:space="preserve">HMSA</w:t>
+      </w:r>
+    </w:p>
     <w:bookmarkEnd w:id="22"/>
-    <w:bookmarkStart w:id="26" w:name="education"/>
-    <w:p>
-      <w:pPr>
-        <w:pStyle w:val="Heading2"/>
-      </w:pPr>
-      <w:r>
-        <w:t xml:space="preserve">Education</w:t>
-      </w:r>
-    </w:p>
-    <w:bookmarkStart w:id="25" w:name="bachelor-of-science"/>
-    <w:p>
-      <w:pPr>
-        <w:pStyle w:val="Heading3"/>
-      </w:pPr>
-      <w:r>
-        <w:t xml:space="preserve">Bachelor of Science</w:t>
-      </w:r>
-    </w:p>
-    <w:bookmarkStart w:id="23" w:name="university-of-california-irvine"/>
+    <w:bookmarkStart w:id="23" w:name="honolulu-hi"/>
     <w:p>
       <w:pPr>
         <w:pStyle w:val="Heading4"/>
       </w:pPr>
       <w:r>
-        <w:t xml:space="preserve">University of California, Irvine</w:t>
-      </w:r>
-    </w:p>
-    <w:bookmarkEnd w:id="23"/>
-    <w:bookmarkStart w:id="24" w:name="irvine-ca"/>
-    <w:p>
-      <w:pPr>
-        <w:pStyle w:val="Heading4"/>
-      </w:pPr>
-      <w:r>
-        <w:t xml:space="preserve">Irvine, CA</w:t>
+        <w:t xml:space="preserve">Honolulu, HI</w:t>
       </w:r>
     </w:p>
     <w:p>
@@ -427,7 +381,7 @@
         <w:pStyle w:val="FirstParagraph"/>
       </w:pPr>
       <w:r>
-        <w:t xml:space="preserve">2018</w:t>
+        <w:t xml:space="preserve">January 2019 - March 2020</w:t>
       </w:r>
     </w:p>
     <w:p>
@@ -439,7 +393,7 @@
         </w:numPr>
       </w:pPr>
       <w:r>
-        <w:t xml:space="preserve">Major in Mathematics</w:t>
+        <w:t xml:space="preserve">Automated CRG band renewal in R, reducing runtime from 8 hours to under 1 minute.</w:t>
       </w:r>
     </w:p>
     <w:p>
@@ -451,13 +405,109 @@
         </w:numPr>
       </w:pPr>
       <w:r>
-        <w:t xml:space="preserve">Minor in Statistics</w:t>
-      </w:r>
-    </w:p>
+        <w:t xml:space="preserve">Automated demographic and plan risk factor workflows and forecasting models with Excel/R integration.</w:t>
+      </w:r>
+    </w:p>
+    <w:p>
+      <w:pPr>
+        <w:pStyle w:val="Compact"/>
+        <w:numPr>
+          <w:ilvl w:val="0"/>
+          <w:numId w:val="1004"/>
+        </w:numPr>
+      </w:pPr>
+      <w:r>
+        <w:t xml:space="preserve">Automated CRG proposal and mental health parity processes; documented methods and led stakeholder walkthroughs.</w:t>
+      </w:r>
+    </w:p>
+    <w:p>
+      <w:pPr>
+        <w:pStyle w:val="Compact"/>
+        <w:numPr>
+          <w:ilvl w:val="0"/>
+          <w:numId w:val="1004"/>
+        </w:numPr>
+      </w:pPr>
+      <w:r>
+        <w:t xml:space="preserve">Fit empirical distributions using KS tests and MLE for actuarial modeling.</w:t>
+      </w:r>
+    </w:p>
+    <w:bookmarkEnd w:id="23"/>
     <w:bookmarkEnd w:id="24"/>
     <w:bookmarkEnd w:id="25"/>
+    <w:bookmarkStart w:id="29" w:name="education"/>
+    <w:p>
+      <w:pPr>
+        <w:pStyle w:val="Heading2"/>
+      </w:pPr>
+      <w:r>
+        <w:t xml:space="preserve">Education</w:t>
+      </w:r>
+    </w:p>
+    <w:bookmarkStart w:id="28" w:name="bachelor-of-science"/>
+    <w:p>
+      <w:pPr>
+        <w:pStyle w:val="Heading3"/>
+      </w:pPr>
+      <w:r>
+        <w:t xml:space="preserve">Bachelor of Science</w:t>
+      </w:r>
+    </w:p>
+    <w:bookmarkStart w:id="26" w:name="university-of-california-irvine"/>
+    <w:p>
+      <w:pPr>
+        <w:pStyle w:val="Heading4"/>
+      </w:pPr>
+      <w:r>
+        <w:t xml:space="preserve">University of California, Irvine</w:t>
+      </w:r>
+    </w:p>
     <w:bookmarkEnd w:id="26"/>
-    <w:bookmarkStart w:id="30" w:name="awards"/>
+    <w:bookmarkStart w:id="27" w:name="irvine-ca"/>
+    <w:p>
+      <w:pPr>
+        <w:pStyle w:val="Heading4"/>
+      </w:pPr>
+      <w:r>
+        <w:t xml:space="preserve">Irvine, CA</w:t>
+      </w:r>
+    </w:p>
+    <w:p>
+      <w:pPr>
+        <w:pStyle w:val="FirstParagraph"/>
+      </w:pPr>
+      <w:r>
+        <w:t xml:space="preserve">2018</w:t>
+      </w:r>
+    </w:p>
+    <w:p>
+      <w:pPr>
+        <w:pStyle w:val="Compact"/>
+        <w:numPr>
+          <w:ilvl w:val="0"/>
+          <w:numId w:val="1005"/>
+        </w:numPr>
+      </w:pPr>
+      <w:r>
+        <w:t xml:space="preserve">Major in Mathematics</w:t>
+      </w:r>
+    </w:p>
+    <w:p>
+      <w:pPr>
+        <w:pStyle w:val="Compact"/>
+        <w:numPr>
+          <w:ilvl w:val="0"/>
+          <w:numId w:val="1005"/>
+        </w:numPr>
+      </w:pPr>
+      <w:r>
+        <w:t xml:space="preserve">Minor in Statistics</w:t>
+      </w:r>
+    </w:p>
+    <w:bookmarkEnd w:id="27"/>
+    <w:bookmarkEnd w:id="28"/>
+    <w:bookmarkEnd w:id="29"/>
+    <w:bookmarkStart w:id="33" w:name="awards"/>
     <w:p>
       <w:pPr>
         <w:pStyle w:val="Heading2"/>
@@ -466,7 +516,7 @@
         <w:t xml:space="preserve">Awards</w:t>
       </w:r>
     </w:p>
-    <w:bookmarkStart w:id="29" w:name="X2250b0ba64101f53b5fdfff6ab9a85e023ab2b4"/>
+    <w:bookmarkStart w:id="32" w:name="X2250b0ba64101f53b5fdfff6ab9a85e023ab2b4"/>
     <w:p>
       <w:pPr>
         <w:pStyle w:val="Heading3"/>
@@ -474,7 +524,7 @@
       <w:r>
         <w:t xml:space="preserve">BAS UCLA Case Competition Finalist (</w:t>
       </w:r>
-      <w:hyperlink r:id="rId27">
+      <w:hyperlink r:id="rId30">
         <w:r>
           <w:rPr>
             <w:rStyle w:val="Hyperlink"/>
@@ -491,7 +541,7 @@
       <w:r>
         <w:t xml:space="preserve"> </w:t>
       </w:r>
-      <w:hyperlink r:id="rId28">
+      <w:hyperlink r:id="rId31">
         <w:r>
           <w:rPr>
             <w:rStyle w:val="Hyperlink"/>
@@ -503,9 +553,9 @@
         <w:t xml:space="preserve">)</w:t>
       </w:r>
     </w:p>
-    <w:bookmarkEnd w:id="29"/>
-    <w:bookmarkEnd w:id="30"/>
-    <w:bookmarkStart w:id="32" w:name="credentials"/>
+    <w:bookmarkEnd w:id="32"/>
+    <w:bookmarkEnd w:id="33"/>
+    <w:bookmarkStart w:id="35" w:name="credentials"/>
     <w:p>
       <w:pPr>
         <w:pStyle w:val="Heading2"/>
@@ -514,7 +564,7 @@
         <w:t xml:space="preserve">Credentials</w:t>
       </w:r>
     </w:p>
-    <w:bookmarkStart w:id="31" w:name="passed-3-actuarial-exams-exam-p-fm-srm"/>
+    <w:bookmarkStart w:id="34" w:name="passed-3-actuarial-exams-exam-p-fm-srm"/>
     <w:p>
       <w:pPr>
         <w:pStyle w:val="Heading3"/>
@@ -523,9 +573,9 @@
         <w:t xml:space="preserve">Passed 3 Actuarial Exams (Exam P, FM, SRM)</w:t>
       </w:r>
     </w:p>
-    <w:bookmarkEnd w:id="31"/>
-    <w:bookmarkEnd w:id="32"/>
-    <w:bookmarkStart w:id="33" w:name="skills"/>
+    <w:bookmarkEnd w:id="34"/>
+    <w:bookmarkEnd w:id="35"/>
+    <w:bookmarkStart w:id="36" w:name="skills"/>
     <w:p>
       <w:pPr>
         <w:pStyle w:val="Heading2"/>
@@ -538,7 +588,7 @@
       <w:pPr>
         <w:numPr>
           <w:ilvl w:val="0"/>
-          <w:numId w:val="1005"/>
+          <w:numId w:val="1006"/>
         </w:numPr>
       </w:pPr>
       <w:r>
@@ -549,7 +599,7 @@
       <w:pPr>
         <w:numPr>
           <w:ilvl w:val="0"/>
-          <w:numId w:val="1005"/>
+          <w:numId w:val="1006"/>
         </w:numPr>
       </w:pPr>
       <w:r>
@@ -560,7 +610,7 @@
       <w:pPr>
         <w:numPr>
           <w:ilvl w:val="0"/>
-          <w:numId w:val="1005"/>
+          <w:numId w:val="1006"/>
         </w:numPr>
       </w:pPr>
       <w:r>
@@ -571,7 +621,7 @@
       <w:pPr>
         <w:numPr>
           <w:ilvl w:val="0"/>
-          <w:numId w:val="1005"/>
+          <w:numId w:val="1006"/>
         </w:numPr>
       </w:pPr>
       <w:r>
@@ -582,14 +632,14 @@
       <w:pPr>
         <w:numPr>
           <w:ilvl w:val="0"/>
-          <w:numId w:val="1005"/>
+          <w:numId w:val="1006"/>
         </w:numPr>
       </w:pPr>
       <w:r>
         <w:t xml:space="preserve">Excel: Advanced formulas, automation, VBA</w:t>
       </w:r>
     </w:p>
-    <w:bookmarkEnd w:id="33"/>
+    <w:bookmarkEnd w:id="36"/>
     <w:sectPr>
       <w:pgSz w:h="15840" w:w="12240"/>
       <w:pgMar w:bottom="423" w:footer="720" w:gutter="0" w:header="720" w:left="1440" w:right="1440" w:top="1134"/>
@@ -2453,6 +2503,9 @@
     <w:abstractNumId w:val="991"/>
   </w:num>
   <w:num w:numId="1005">
+    <w:abstractNumId w:val="991"/>
+  </w:num>
+  <w:num w:numId="1006">
     <w:abstractNumId w:val="991"/>
   </w:num>
 </w:numbering>

</xml_diff>

<commit_message>
Add Selected Projects section to CV and refresh GitHub skills
</commit_message>
<xml_diff>
--- a/cv_doc.docx
+++ b/cv_doc.docx
@@ -81,7 +81,7 @@
       </w:r>
     </w:p>
     <w:bookmarkEnd w:id="12"/>
-    <w:bookmarkStart w:id="25" w:name="professional-experience"/>
+    <w:bookmarkStart w:id="22" w:name="professional-experience"/>
     <w:p>
       <w:pPr>
         <w:pStyle w:val="Heading2"/>
@@ -90,32 +90,32 @@
         <w:t xml:space="preserve">Professional Experience</w:t>
       </w:r>
     </w:p>
-    <w:bookmarkStart w:id="15" w:name="nda"/>
+    <w:bookmarkStart w:id="15" w:name="senior-data-scientist"/>
     <w:p>
       <w:pPr>
         <w:pStyle w:val="Heading3"/>
       </w:pPr>
       <w:r>
-        <w:t xml:space="preserve">NDA</w:t>
-      </w:r>
-    </w:p>
-    <w:bookmarkStart w:id="13" w:name="nda-1"/>
+        <w:t xml:space="preserve">Senior Data Scientist</w:t>
+      </w:r>
+    </w:p>
+    <w:bookmarkStart w:id="13" w:name="grail"/>
     <w:p>
       <w:pPr>
         <w:pStyle w:val="Heading4"/>
       </w:pPr>
       <w:r>
-        <w:t xml:space="preserve">NDA</w:t>
+        <w:t xml:space="preserve">GRAIL</w:t>
       </w:r>
     </w:p>
     <w:bookmarkEnd w:id="13"/>
-    <w:bookmarkStart w:id="14" w:name="na"/>
+    <w:bookmarkStart w:id="14" w:name="menlo-park-ca"/>
     <w:p>
       <w:pPr>
         <w:pStyle w:val="Heading4"/>
       </w:pPr>
       <w:r>
-        <w:t xml:space="preserve">N/A</w:t>
+        <w:t xml:space="preserve">Menlo Park, CA</w:t>
       </w:r>
     </w:p>
     <w:p>
@@ -123,7 +123,7 @@
         <w:pStyle w:val="FirstParagraph"/>
       </w:pPr>
       <w:r>
-        <w:t xml:space="preserve">September 2024 - August 2026</w:t>
+        <w:t xml:space="preserve">February 2021 - August 2024</w:t>
       </w:r>
     </w:p>
     <w:p>
@@ -135,37 +135,109 @@
         </w:numPr>
       </w:pPr>
       <w:r>
-        <w:t xml:space="preserve">Biotech R Programming Consultant</w:t>
+        <w:t xml:space="preserve">Authored and maintained multiple production R packages used company-wide for clinical trial analysis, validation, and reporting.</w:t>
+      </w:r>
+    </w:p>
+    <w:p>
+      <w:pPr>
+        <w:pStyle w:val="Compact"/>
+        <w:numPr>
+          <w:ilvl w:val="0"/>
+          <w:numId w:val="1001"/>
+        </w:numPr>
+      </w:pPr>
+      <w:r>
+        <w:t xml:space="preserve">Built automated R Markdown pipelines generating hundreds of Tables, Figures, and Listings (TFLs) to support trial accuracy assessments and regulatory reporting.</w:t>
+      </w:r>
+    </w:p>
+    <w:p>
+      <w:pPr>
+        <w:pStyle w:val="Compact"/>
+        <w:numPr>
+          <w:ilvl w:val="0"/>
+          <w:numId w:val="1001"/>
+        </w:numPr>
+      </w:pPr>
+      <w:r>
+        <w:t xml:space="preserve">Developed and documented derived variables under CDISC standards (SDTM, ADaM, CDASH) with Git/GitLab collaboration and AWS S3 data management.</w:t>
+      </w:r>
+    </w:p>
+    <w:p>
+      <w:pPr>
+        <w:pStyle w:val="Compact"/>
+        <w:numPr>
+          <w:ilvl w:val="0"/>
+          <w:numId w:val="1001"/>
+        </w:numPr>
+      </w:pPr>
+      <w:r>
+        <w:t xml:space="preserve">Created an R Shiny app to visualize cancer screening timelines and key events leading to diagnosis.</w:t>
+      </w:r>
+    </w:p>
+    <w:p>
+      <w:pPr>
+        <w:pStyle w:val="Compact"/>
+        <w:numPr>
+          <w:ilvl w:val="0"/>
+          <w:numId w:val="1001"/>
+        </w:numPr>
+      </w:pPr>
+      <w:r>
+        <w:t xml:space="preserve">Provided statistical programming support for data cleaning, database locks, SAP-driven analyses, and exploratory investigations.</w:t>
+      </w:r>
+    </w:p>
+    <w:p>
+      <w:pPr>
+        <w:pStyle w:val="Compact"/>
+        <w:numPr>
+          <w:ilvl w:val="0"/>
+          <w:numId w:val="1001"/>
+        </w:numPr>
+      </w:pPr>
+      <w:r>
+        <w:t xml:space="preserve">Partnered with biostatisticians to translate SAPs into analysis specifications and reusable code.</w:t>
+      </w:r>
+    </w:p>
+    <w:p>
+      <w:pPr>
+        <w:pStyle w:val="Compact"/>
+        <w:numPr>
+          <w:ilvl w:val="0"/>
+          <w:numId w:val="1001"/>
+        </w:numPr>
+      </w:pPr>
+      <w:r>
+        <w:t xml:space="preserve">Built reproducible pipelines with unit tests and a shared code library to ensure audit-ready, backward-compatible outputs.</w:t>
       </w:r>
     </w:p>
     <w:bookmarkEnd w:id="14"/>
     <w:bookmarkEnd w:id="15"/>
-    <w:bookmarkStart w:id="18" w:name="senior-data-scientist"/>
+    <w:bookmarkStart w:id="18" w:name="reporting-analyst"/>
     <w:p>
       <w:pPr>
         <w:pStyle w:val="Heading3"/>
       </w:pPr>
       <w:r>
-        <w:t xml:space="preserve">Senior Data Scientist</w:t>
-      </w:r>
-    </w:p>
-    <w:bookmarkStart w:id="16" w:name="grail"/>
+        <w:t xml:space="preserve">Reporting Analyst</w:t>
+      </w:r>
+    </w:p>
+    <w:bookmarkStart w:id="16" w:name="hour-home-care"/>
     <w:p>
       <w:pPr>
         <w:pStyle w:val="Heading4"/>
       </w:pPr>
       <w:r>
-        <w:t xml:space="preserve">GRAIL</w:t>
+        <w:t xml:space="preserve">24 Hour Home Care</w:t>
       </w:r>
     </w:p>
     <w:bookmarkEnd w:id="16"/>
-    <w:bookmarkStart w:id="17" w:name="menlo-park-ca"/>
+    <w:bookmarkStart w:id="17" w:name="el-segundo-ca"/>
     <w:p>
       <w:pPr>
         <w:pStyle w:val="Heading4"/>
       </w:pPr>
       <w:r>
-        <w:t xml:space="preserve">Menlo Park, CA</w:t>
+        <w:t xml:space="preserve">El Segundo, CA</w:t>
       </w:r>
     </w:p>
     <w:p>
@@ -173,7 +245,7 @@
         <w:pStyle w:val="FirstParagraph"/>
       </w:pPr>
       <w:r>
-        <w:t xml:space="preserve">February 2021 - August 2024</w:t>
+        <w:t xml:space="preserve">April 2020 - January 2021</w:t>
       </w:r>
     </w:p>
     <w:p>
@@ -185,7 +257,7 @@
         </w:numPr>
       </w:pPr>
       <w:r>
-        <w:t xml:space="preserve">Authored and maintained multiple production R packages used company-wide for clinical trial analysis, validation, and reporting.</w:t>
+        <w:t xml:space="preserve">Automated weekly accounts receivable aging report in R with HTML/CSS email delivery, saving ~5 hours per week.</w:t>
       </w:r>
     </w:p>
     <w:p>
@@ -197,7 +269,7 @@
         </w:numPr>
       </w:pPr>
       <w:r>
-        <w:t xml:space="preserve">Built automated R Markdown pipelines generating hundreds of Tables, Figures, and Listings (TFLs) to support trial accuracy assessments and regulatory reporting.</w:t>
+        <w:t xml:space="preserve">Built ad hoc dashboards and data visualizations to support leadership requests.</w:t>
       </w:r>
     </w:p>
     <w:p>
@@ -209,7 +281,7 @@
         </w:numPr>
       </w:pPr>
       <w:r>
-        <w:t xml:space="preserve">Developed and documented derived variables under CDISC standards (SDTM, ADaM, CDASH) with Git/GitLab collaboration and AWS S3 data management.</w:t>
+        <w:t xml:space="preserve">Served as analytics liaison across teams to align reporting needs and delivery.</w:t>
       </w:r>
     </w:p>
     <w:p>
@@ -221,73 +293,37 @@
         </w:numPr>
       </w:pPr>
       <w:r>
-        <w:t xml:space="preserve">Created an R Shiny app to visualize cancer screening timelines and key events leading to diagnosis.</w:t>
-      </w:r>
-    </w:p>
-    <w:p>
-      <w:pPr>
-        <w:pStyle w:val="Compact"/>
-        <w:numPr>
-          <w:ilvl w:val="0"/>
-          <w:numId w:val="1002"/>
-        </w:numPr>
-      </w:pPr>
-      <w:r>
-        <w:t xml:space="preserve">Provided statistical programming support for data cleaning, database locks, SAP-driven analyses, and exploratory investigations.</w:t>
-      </w:r>
-    </w:p>
-    <w:p>
-      <w:pPr>
-        <w:pStyle w:val="Compact"/>
-        <w:numPr>
-          <w:ilvl w:val="0"/>
-          <w:numId w:val="1002"/>
-        </w:numPr>
-      </w:pPr>
-      <w:r>
-        <w:t xml:space="preserve">Partnered with biostatisticians to translate SAPs into analysis specifications and reusable code.</w:t>
-      </w:r>
-    </w:p>
-    <w:p>
-      <w:pPr>
-        <w:pStyle w:val="Compact"/>
-        <w:numPr>
-          <w:ilvl w:val="0"/>
-          <w:numId w:val="1002"/>
-        </w:numPr>
-      </w:pPr>
-      <w:r>
-        <w:t xml:space="preserve">Built reproducible pipelines with unit tests and a shared code library to ensure audit-ready, backward-compatible outputs.</w:t>
+        <w:t xml:space="preserve">Automated batch invoice emails and Azure Web App exports, reducing manual effort across teams.</w:t>
       </w:r>
     </w:p>
     <w:bookmarkEnd w:id="17"/>
     <w:bookmarkEnd w:id="18"/>
-    <w:bookmarkStart w:id="21" w:name="reporting-analyst"/>
+    <w:bookmarkStart w:id="21" w:name="actuarial-analyst"/>
     <w:p>
       <w:pPr>
         <w:pStyle w:val="Heading3"/>
       </w:pPr>
       <w:r>
-        <w:t xml:space="preserve">Reporting Analyst</w:t>
-      </w:r>
-    </w:p>
-    <w:bookmarkStart w:id="19" w:name="hour-home-care"/>
+        <w:t xml:space="preserve">Actuarial Analyst</w:t>
+      </w:r>
+    </w:p>
+    <w:bookmarkStart w:id="19" w:name="hmsa"/>
     <w:p>
       <w:pPr>
         <w:pStyle w:val="Heading4"/>
       </w:pPr>
       <w:r>
-        <w:t xml:space="preserve">24 Hour Home Care</w:t>
+        <w:t xml:space="preserve">HMSA</w:t>
       </w:r>
     </w:p>
     <w:bookmarkEnd w:id="19"/>
-    <w:bookmarkStart w:id="20" w:name="el-segundo-ca"/>
+    <w:bookmarkStart w:id="20" w:name="honolulu-hi"/>
     <w:p>
       <w:pPr>
         <w:pStyle w:val="Heading4"/>
       </w:pPr>
       <w:r>
-        <w:t xml:space="preserve">El Segundo, CA</w:t>
+        <w:t xml:space="preserve">Honolulu, HI</w:t>
       </w:r>
     </w:p>
     <w:p>
@@ -295,7 +331,7 @@
         <w:pStyle w:val="FirstParagraph"/>
       </w:pPr>
       <w:r>
-        <w:t xml:space="preserve">April 2020 - January 2021</w:t>
+        <w:t xml:space="preserve">January 2019 - March 2020</w:t>
       </w:r>
     </w:p>
     <w:p>
@@ -307,7 +343,7 @@
         </w:numPr>
       </w:pPr>
       <w:r>
-        <w:t xml:space="preserve">Automated weekly accounts receivable aging report in R with HTML/CSS email delivery, saving ~5 hours per week.</w:t>
+        <w:t xml:space="preserve">Automated CRG band renewal in R, reducing runtime from 8 hours to under 1 minute.</w:t>
       </w:r>
     </w:p>
     <w:p>
@@ -319,7 +355,7 @@
         </w:numPr>
       </w:pPr>
       <w:r>
-        <w:t xml:space="preserve">Built ad hoc dashboards and data visualizations to support leadership requests.</w:t>
+        <w:t xml:space="preserve">Automated demographic and plan risk factor workflows and forecasting models with Excel/R integration.</w:t>
       </w:r>
     </w:p>
     <w:p>
@@ -331,7 +367,7 @@
         </w:numPr>
       </w:pPr>
       <w:r>
-        <w:t xml:space="preserve">Served as analytics liaison across teams to align reporting needs and delivery.</w:t>
+        <w:t xml:space="preserve">Automated CRG proposal and mental health parity processes; documented methods and led stakeholder walkthroughs.</w:t>
       </w:r>
     </w:p>
     <w:p>
@@ -343,46 +379,43 @@
         </w:numPr>
       </w:pPr>
       <w:r>
-        <w:t xml:space="preserve">Automated batch invoice emails and Azure Web App exports, reducing manual effort across teams.</w:t>
+        <w:t xml:space="preserve">Fit empirical distributions using KS tests and MLE for actuarial modeling.</w:t>
       </w:r>
     </w:p>
     <w:bookmarkEnd w:id="20"/>
     <w:bookmarkEnd w:id="21"/>
-    <w:bookmarkStart w:id="24" w:name="actuarial-analyst"/>
+    <w:bookmarkEnd w:id="22"/>
+    <w:bookmarkStart w:id="32" w:name="selected-projects"/>
+    <w:p>
+      <w:pPr>
+        <w:pStyle w:val="Heading2"/>
+      </w:pPr>
+      <w:r>
+        <w:t xml:space="preserve">Selected Projects</w:t>
+      </w:r>
+    </w:p>
+    <w:bookmarkStart w:id="25" w:name="personal-data-site"/>
     <w:p>
       <w:pPr>
         <w:pStyle w:val="Heading3"/>
       </w:pPr>
       <w:r>
-        <w:t xml:space="preserve">Actuarial Analyst</w:t>
-      </w:r>
-    </w:p>
-    <w:bookmarkStart w:id="22" w:name="hmsa"/>
+        <w:t xml:space="preserve">Personal Data Site</w:t>
+      </w:r>
+    </w:p>
+    <w:bookmarkStart w:id="24" w:name="cavandonohoe.github.io"/>
     <w:p>
       <w:pPr>
         <w:pStyle w:val="Heading4"/>
       </w:pPr>
-      <w:r>
-        <w:t xml:space="preserve">HMSA</w:t>
-      </w:r>
-    </w:p>
-    <w:bookmarkEnd w:id="22"/>
-    <w:bookmarkStart w:id="23" w:name="honolulu-hi"/>
-    <w:p>
-      <w:pPr>
-        <w:pStyle w:val="Heading4"/>
-      </w:pPr>
-      <w:r>
-        <w:t xml:space="preserve">Honolulu, HI</w:t>
-      </w:r>
-    </w:p>
-    <w:p>
-      <w:pPr>
-        <w:pStyle w:val="FirstParagraph"/>
-      </w:pPr>
-      <w:r>
-        <w:t xml:space="preserve">January 2019 - March 2020</w:t>
-      </w:r>
+      <w:hyperlink r:id="rId23">
+        <w:r>
+          <w:rPr>
+            <w:rStyle w:val="Hyperlink"/>
+          </w:rPr>
+          <w:t xml:space="preserve">cavandonohoe.github.io</w:t>
+        </w:r>
+      </w:hyperlink>
     </w:p>
     <w:p>
       <w:pPr>
@@ -393,7 +426,7 @@
         </w:numPr>
       </w:pPr>
       <w:r>
-        <w:t xml:space="preserve">Automated CRG band renewal in R, reducing runtime from 8 hours to under 1 minute.</w:t>
+        <w:t xml:space="preserve">Built 40+ GitHub Actions workflows that refresh datasets on a schedule (IMDb, S&amp;P 500, rental markets, box office)</w:t>
       </w:r>
     </w:p>
     <w:p>
@@ -405,7 +438,7 @@
         </w:numPr>
       </w:pPr>
       <w:r>
-        <w:t xml:space="preserve">Automated demographic and plan risk factor workflows and forecasting models with Excel/R integration.</w:t>
+        <w:t xml:space="preserve">Gated every PR with lint, tests, typo and link checks, and Lighthouse/pa11y accessibility audits</w:t>
       </w:r>
     </w:p>
     <w:p>
@@ -417,7 +450,7 @@
         </w:numPr>
       </w:pPr>
       <w:r>
-        <w:t xml:space="preserve">Automated CRG proposal and mental health parity processes; documented methods and led stakeholder walkthroughs.</w:t>
+        <w:t xml:space="preserve">Set up per-branch preview deploys with automatic pruning, Dependabot auto-merge, and failure alerts</w:t>
       </w:r>
     </w:p>
     <w:p>
@@ -429,56 +462,33 @@
         </w:numPr>
       </w:pPr>
       <w:r>
-        <w:t xml:space="preserve">Fit empirical distributions using KS tests and MLE for actuarial modeling.</w:t>
-      </w:r>
-    </w:p>
-    <w:bookmarkEnd w:id="23"/>
+        <w:t xml:space="preserve">Resume rebuilds automatically from a Google Sheet through a scheduled workflow</w:t>
+      </w:r>
+    </w:p>
     <w:bookmarkEnd w:id="24"/>
     <w:bookmarkEnd w:id="25"/>
-    <w:bookmarkStart w:id="29" w:name="education"/>
-    <w:p>
-      <w:pPr>
-        <w:pStyle w:val="Heading2"/>
-      </w:pPr>
-      <w:r>
-        <w:t xml:space="preserve">Education</w:t>
-      </w:r>
-    </w:p>
-    <w:bookmarkStart w:id="28" w:name="bachelor-of-science"/>
+    <w:bookmarkStart w:id="28" w:name="rent-vs.-buy"/>
     <w:p>
       <w:pPr>
         <w:pStyle w:val="Heading3"/>
       </w:pPr>
       <w:r>
-        <w:t xml:space="preserve">Bachelor of Science</w:t>
-      </w:r>
-    </w:p>
-    <w:bookmarkStart w:id="26" w:name="university-of-california-irvine"/>
+        <w:t xml:space="preserve">Rent vs. Buy</w:t>
+      </w:r>
+    </w:p>
+    <w:bookmarkStart w:id="27" w:name="r-shiny-app"/>
     <w:p>
       <w:pPr>
         <w:pStyle w:val="Heading4"/>
       </w:pPr>
-      <w:r>
-        <w:t xml:space="preserve">University of California, Irvine</w:t>
-      </w:r>
-    </w:p>
-    <w:bookmarkEnd w:id="26"/>
-    <w:bookmarkStart w:id="27" w:name="irvine-ca"/>
-    <w:p>
-      <w:pPr>
-        <w:pStyle w:val="Heading4"/>
-      </w:pPr>
-      <w:r>
-        <w:t xml:space="preserve">Irvine, CA</w:t>
-      </w:r>
-    </w:p>
-    <w:p>
-      <w:pPr>
-        <w:pStyle w:val="FirstParagraph"/>
-      </w:pPr>
-      <w:r>
-        <w:t xml:space="preserve">2018</w:t>
-      </w:r>
+      <w:hyperlink r:id="rId26">
+        <w:r>
+          <w:rPr>
+            <w:rStyle w:val="Hyperlink"/>
+          </w:rPr>
+          <w:t xml:space="preserve">R Shiny app</w:t>
+        </w:r>
+      </w:hyperlink>
     </w:p>
     <w:p>
       <w:pPr>
@@ -489,7 +499,7 @@
         </w:numPr>
       </w:pPr>
       <w:r>
-        <w:t xml:space="preserve">Major in Mathematics</w:t>
+        <w:t xml:space="preserve">Interactive app comparing the long-run financial outcomes of renting vs. buying a home</w:t>
       </w:r>
     </w:p>
     <w:p>
@@ -501,22 +511,143 @@
         </w:numPr>
       </w:pPr>
       <w:r>
-        <w:t xml:space="preserve">Minor in Statistics</w:t>
+        <w:t xml:space="preserve">CI runs tests, then deploys automatically to shinyapps.io</w:t>
       </w:r>
     </w:p>
     <w:bookmarkEnd w:id="27"/>
     <w:bookmarkEnd w:id="28"/>
-    <w:bookmarkEnd w:id="29"/>
-    <w:bookmarkStart w:id="33" w:name="awards"/>
+    <w:bookmarkStart w:id="31" w:name="confederate-statues"/>
+    <w:p>
+      <w:pPr>
+        <w:pStyle w:val="Heading3"/>
+      </w:pPr>
+      <w:r>
+        <w:t xml:space="preserve">Confederate Statues</w:t>
+      </w:r>
+    </w:p>
+    <w:bookmarkStart w:id="30" w:name="github"/>
+    <w:p>
+      <w:pPr>
+        <w:pStyle w:val="Heading4"/>
+      </w:pPr>
+      <w:hyperlink r:id="rId29">
+        <w:r>
+          <w:rPr>
+            <w:rStyle w:val="Hyperlink"/>
+          </w:rPr>
+          <w:t xml:space="preserve">GitHub</w:t>
+        </w:r>
+      </w:hyperlink>
+    </w:p>
+    <w:p>
+      <w:pPr>
+        <w:pStyle w:val="Compact"/>
+        <w:numPr>
+          <w:ilvl w:val="0"/>
+          <w:numId w:val="1006"/>
+        </w:numPr>
+      </w:pPr>
+      <w:r>
+        <w:t xml:space="preserve">Scraped Wikipedia in R and Python to build a dataset of when Confederate statues were erected</w:t>
+      </w:r>
+    </w:p>
+    <w:p>
+      <w:pPr>
+        <w:pStyle w:val="Compact"/>
+        <w:numPr>
+          <w:ilvl w:val="0"/>
+          <w:numId w:val="1006"/>
+        </w:numPr>
+      </w:pPr>
+      <w:r>
+        <w:t xml:space="preserve">Data refreshes on a schedule, with CI and a Docker build for the service</w:t>
+      </w:r>
+    </w:p>
+    <w:bookmarkEnd w:id="30"/>
+    <w:bookmarkEnd w:id="31"/>
+    <w:bookmarkEnd w:id="32"/>
+    <w:bookmarkStart w:id="36" w:name="education"/>
     <w:p>
       <w:pPr>
         <w:pStyle w:val="Heading2"/>
       </w:pPr>
       <w:r>
+        <w:t xml:space="preserve">Education</w:t>
+      </w:r>
+    </w:p>
+    <w:bookmarkStart w:id="35" w:name="bachelor-of-science"/>
+    <w:p>
+      <w:pPr>
+        <w:pStyle w:val="Heading3"/>
+      </w:pPr>
+      <w:r>
+        <w:t xml:space="preserve">Bachelor of Science</w:t>
+      </w:r>
+    </w:p>
+    <w:bookmarkStart w:id="33" w:name="university-of-california-irvine"/>
+    <w:p>
+      <w:pPr>
+        <w:pStyle w:val="Heading4"/>
+      </w:pPr>
+      <w:r>
+        <w:t xml:space="preserve">University of California, Irvine</w:t>
+      </w:r>
+    </w:p>
+    <w:bookmarkEnd w:id="33"/>
+    <w:bookmarkStart w:id="34" w:name="irvine-ca"/>
+    <w:p>
+      <w:pPr>
+        <w:pStyle w:val="Heading4"/>
+      </w:pPr>
+      <w:r>
+        <w:t xml:space="preserve">Irvine, CA</w:t>
+      </w:r>
+    </w:p>
+    <w:p>
+      <w:pPr>
+        <w:pStyle w:val="FirstParagraph"/>
+      </w:pPr>
+      <w:r>
+        <w:t xml:space="preserve">2018</w:t>
+      </w:r>
+    </w:p>
+    <w:p>
+      <w:pPr>
+        <w:pStyle w:val="Compact"/>
+        <w:numPr>
+          <w:ilvl w:val="0"/>
+          <w:numId w:val="1007"/>
+        </w:numPr>
+      </w:pPr>
+      <w:r>
+        <w:t xml:space="preserve">Major in Mathematics</w:t>
+      </w:r>
+    </w:p>
+    <w:p>
+      <w:pPr>
+        <w:pStyle w:val="Compact"/>
+        <w:numPr>
+          <w:ilvl w:val="0"/>
+          <w:numId w:val="1007"/>
+        </w:numPr>
+      </w:pPr>
+      <w:r>
+        <w:t xml:space="preserve">Minor in Statistics</w:t>
+      </w:r>
+    </w:p>
+    <w:bookmarkEnd w:id="34"/>
+    <w:bookmarkEnd w:id="35"/>
+    <w:bookmarkEnd w:id="36"/>
+    <w:bookmarkStart w:id="40" w:name="awards"/>
+    <w:p>
+      <w:pPr>
+        <w:pStyle w:val="Heading2"/>
+      </w:pPr>
+      <w:r>
         <w:t xml:space="preserve">Awards</w:t>
       </w:r>
     </w:p>
-    <w:bookmarkStart w:id="32" w:name="X2250b0ba64101f53b5fdfff6ab9a85e023ab2b4"/>
+    <w:bookmarkStart w:id="39" w:name="X2250b0ba64101f53b5fdfff6ab9a85e023ab2b4"/>
     <w:p>
       <w:pPr>
         <w:pStyle w:val="Heading3"/>
@@ -524,7 +655,7 @@
       <w:r>
         <w:t xml:space="preserve">BAS UCLA Case Competition Finalist (</w:t>
       </w:r>
-      <w:hyperlink r:id="rId30">
+      <w:hyperlink r:id="rId37">
         <w:r>
           <w:rPr>
             <w:rStyle w:val="Hyperlink"/>
@@ -541,7 +672,7 @@
       <w:r>
         <w:t xml:space="preserve"> </w:t>
       </w:r>
-      <w:hyperlink r:id="rId31">
+      <w:hyperlink r:id="rId38">
         <w:r>
           <w:rPr>
             <w:rStyle w:val="Hyperlink"/>
@@ -553,9 +684,9 @@
         <w:t xml:space="preserve">)</w:t>
       </w:r>
     </w:p>
-    <w:bookmarkEnd w:id="32"/>
-    <w:bookmarkEnd w:id="33"/>
-    <w:bookmarkStart w:id="35" w:name="credentials"/>
+    <w:bookmarkEnd w:id="39"/>
+    <w:bookmarkEnd w:id="40"/>
+    <w:bookmarkStart w:id="42" w:name="credentials"/>
     <w:p>
       <w:pPr>
         <w:pStyle w:val="Heading2"/>
@@ -564,7 +695,7 @@
         <w:t xml:space="preserve">Credentials</w:t>
       </w:r>
     </w:p>
-    <w:bookmarkStart w:id="34" w:name="passed-3-actuarial-exams-exam-p-fm-srm"/>
+    <w:bookmarkStart w:id="41" w:name="passed-3-actuarial-exams-exam-p-fm-srm"/>
     <w:p>
       <w:pPr>
         <w:pStyle w:val="Heading3"/>
@@ -573,9 +704,9 @@
         <w:t xml:space="preserve">Passed 3 Actuarial Exams (Exam P, FM, SRM)</w:t>
       </w:r>
     </w:p>
-    <w:bookmarkEnd w:id="34"/>
-    <w:bookmarkEnd w:id="35"/>
-    <w:bookmarkStart w:id="36" w:name="skills"/>
+    <w:bookmarkEnd w:id="41"/>
+    <w:bookmarkEnd w:id="42"/>
+    <w:bookmarkStart w:id="43" w:name="skills"/>
     <w:p>
       <w:pPr>
         <w:pStyle w:val="Heading2"/>
@@ -588,18 +719,18 @@
       <w:pPr>
         <w:numPr>
           <w:ilvl w:val="0"/>
-          <w:numId w:val="1006"/>
+          <w:numId w:val="1008"/>
         </w:numPr>
       </w:pPr>
       <w:r>
-        <w:t xml:space="preserve">R: tidyverse, data.table, ggplot2, Shiny, R Markdown, package development, unit testing, automation, resampling (bootstrap/jackknife)</w:t>
+        <w:t xml:space="preserve">R: tidyverse, data.table, ggplot2, Shiny, R Markdown, package development, unit testing, resampling</w:t>
       </w:r>
     </w:p>
     <w:p>
       <w:pPr>
         <w:numPr>
           <w:ilvl w:val="0"/>
-          <w:numId w:val="1006"/>
+          <w:numId w:val="1008"/>
         </w:numPr>
       </w:pPr>
       <w:r>
@@ -610,36 +741,47 @@
       <w:pPr>
         <w:numPr>
           <w:ilvl w:val="0"/>
-          <w:numId w:val="1006"/>
+          <w:numId w:val="1008"/>
         </w:numPr>
       </w:pPr>
       <w:r>
-        <w:t xml:space="preserve">Databases: SQL (PostgreSQL)</w:t>
+        <w:t xml:space="preserve">Languages &amp; Data: Python, SQL (PostgreSQL), AWS S3</w:t>
       </w:r>
     </w:p>
     <w:p>
       <w:pPr>
         <w:numPr>
           <w:ilvl w:val="0"/>
-          <w:numId w:val="1006"/>
+          <w:numId w:val="1008"/>
         </w:numPr>
       </w:pPr>
       <w:r>
-        <w:t xml:space="preserve">Developer Tooling: Git/GitLab, CI workflows, AWS S3, AI-assisted development (Cursor, GitHub Copilot, Gemini, Codex) with full manual review and validation</w:t>
+        <w:t xml:space="preserve">Git &amp; CI/CD: Git, GitHub, GitLab, GitHub Actions (scheduled pipelines, test/lint gates, preview deploys), GitLab CI, Docker</w:t>
       </w:r>
     </w:p>
     <w:p>
       <w:pPr>
         <w:numPr>
           <w:ilvl w:val="0"/>
-          <w:numId w:val="1006"/>
+          <w:numId w:val="1008"/>
         </w:numPr>
       </w:pPr>
       <w:r>
-        <w:t xml:space="preserve">Excel: Advanced formulas, automation, VBA</w:t>
-      </w:r>
-    </w:p>
-    <w:bookmarkEnd w:id="36"/>
+        <w:t xml:space="preserve">AI-assisted development (Cursor, Copilot, Codex) with full manual review</w:t>
+      </w:r>
+    </w:p>
+    <w:p>
+      <w:pPr>
+        <w:numPr>
+          <w:ilvl w:val="0"/>
+          <w:numId w:val="1008"/>
+        </w:numPr>
+      </w:pPr>
+      <w:r>
+        <w:t xml:space="preserve">Excel: Advanced formulas, VBA</w:t>
+      </w:r>
+    </w:p>
+    <w:bookmarkEnd w:id="43"/>
     <w:sectPr>
       <w:pgSz w:h="15840" w:w="12240"/>
       <w:pgMar w:bottom="423" w:footer="720" w:gutter="0" w:header="720" w:left="1440" w:right="1440" w:top="1134"/>
@@ -2506,6 +2648,12 @@
     <w:abstractNumId w:val="991"/>
   </w:num>
   <w:num w:numId="1006">
+    <w:abstractNumId w:val="991"/>
+  </w:num>
+  <w:num w:numId="1007">
+    <w:abstractNumId w:val="991"/>
+  </w:num>
+  <w:num w:numId="1008">
     <w:abstractNumId w:val="991"/>
   </w:num>
 </w:numbering>

</xml_diff>

<commit_message>
Fill live GitHub stats into the CV at render time
</commit_message>
<xml_diff>
--- a/cv_doc.docx
+++ b/cv_doc.docx
@@ -426,7 +426,7 @@
         </w:numPr>
       </w:pPr>
       <w:r>
-        <w:t xml:space="preserve">Built 40+ GitHub Actions workflows that refresh datasets on a schedule (IMDb, S&amp;P 500, rental markets, box office)</w:t>
+        <w:t xml:space="preserve">Built 45+ GitHub Actions workflows that refresh datasets on a schedule (IMDb, S&amp;P 500, rental markets, box office)</w:t>
       </w:r>
     </w:p>
     <w:p>
@@ -438,7 +438,7 @@
         </w:numPr>
       </w:pPr>
       <w:r>
-        <w:t xml:space="preserve">Gated every PR with lint, tests, typo and link checks, and Lighthouse/pa11y accessibility audits</w:t>
+        <w:t xml:space="preserve">Shipped 225+ merged PRs and 600+ commits through a CI-gated pull request workflow</w:t>
       </w:r>
     </w:p>
     <w:p>
@@ -450,7 +450,7 @@
         </w:numPr>
       </w:pPr>
       <w:r>
-        <w:t xml:space="preserve">Set up per-branch preview deploys with automatic pruning, Dependabot auto-merge, and failure alerts</w:t>
+        <w:t xml:space="preserve">Gated every PR with lint, tests, typo and link checks, and Lighthouse/pa11y accessibility audits</w:t>
       </w:r>
     </w:p>
     <w:p>
@@ -462,7 +462,19 @@
         </w:numPr>
       </w:pPr>
       <w:r>
-        <w:t xml:space="preserve">Resume rebuilds automatically from a Google Sheet through a scheduled workflow</w:t>
+        <w:t xml:space="preserve">Set up per-branch preview deploys with automatic pruning, Dependabot auto-merge, and failure alerts</w:t>
+      </w:r>
+    </w:p>
+    <w:p>
+      <w:pPr>
+        <w:pStyle w:val="Compact"/>
+        <w:numPr>
+          <w:ilvl w:val="0"/>
+          <w:numId w:val="1004"/>
+        </w:numPr>
+      </w:pPr>
+      <w:r>
+        <w:t xml:space="preserve">Resume rebuilds automatically from a Google Sheet, with live GitHub stats, through a scheduled workflow</w:t>
       </w:r>
     </w:p>
     <w:bookmarkEnd w:id="24"/>

</xml_diff>

<commit_message>
Add Selected Projects section to CV with live GitHub stats (#316)
* Add Selected Projects section to CV and refresh GitHub skills

* Fill live GitHub stats into the CV at render time

* Fall back to cached CV GitHub stats when no token is available
</commit_message>
<xml_diff>
--- a/cv_doc.docx
+++ b/cv_doc.docx
@@ -81,7 +81,7 @@
       </w:r>
     </w:p>
     <w:bookmarkEnd w:id="12"/>
-    <w:bookmarkStart w:id="25" w:name="professional-experience"/>
+    <w:bookmarkStart w:id="22" w:name="professional-experience"/>
     <w:p>
       <w:pPr>
         <w:pStyle w:val="Heading2"/>
@@ -90,32 +90,32 @@
         <w:t xml:space="preserve">Professional Experience</w:t>
       </w:r>
     </w:p>
-    <w:bookmarkStart w:id="15" w:name="nda"/>
+    <w:bookmarkStart w:id="15" w:name="senior-data-scientist"/>
     <w:p>
       <w:pPr>
         <w:pStyle w:val="Heading3"/>
       </w:pPr>
       <w:r>
-        <w:t xml:space="preserve">NDA</w:t>
-      </w:r>
-    </w:p>
-    <w:bookmarkStart w:id="13" w:name="nda-1"/>
+        <w:t xml:space="preserve">Senior Data Scientist</w:t>
+      </w:r>
+    </w:p>
+    <w:bookmarkStart w:id="13" w:name="grail"/>
     <w:p>
       <w:pPr>
         <w:pStyle w:val="Heading4"/>
       </w:pPr>
       <w:r>
-        <w:t xml:space="preserve">NDA</w:t>
+        <w:t xml:space="preserve">GRAIL</w:t>
       </w:r>
     </w:p>
     <w:bookmarkEnd w:id="13"/>
-    <w:bookmarkStart w:id="14" w:name="na"/>
+    <w:bookmarkStart w:id="14" w:name="menlo-park-ca"/>
     <w:p>
       <w:pPr>
         <w:pStyle w:val="Heading4"/>
       </w:pPr>
       <w:r>
-        <w:t xml:space="preserve">N/A</w:t>
+        <w:t xml:space="preserve">Menlo Park, CA</w:t>
       </w:r>
     </w:p>
     <w:p>
@@ -123,7 +123,7 @@
         <w:pStyle w:val="FirstParagraph"/>
       </w:pPr>
       <w:r>
-        <w:t xml:space="preserve">September 2024 - August 2026</w:t>
+        <w:t xml:space="preserve">February 2021 - August 2024</w:t>
       </w:r>
     </w:p>
     <w:p>
@@ -135,37 +135,109 @@
         </w:numPr>
       </w:pPr>
       <w:r>
-        <w:t xml:space="preserve">Biotech R Programming Consultant</w:t>
+        <w:t xml:space="preserve">Authored and maintained multiple production R packages used company-wide for clinical trial analysis, validation, and reporting.</w:t>
+      </w:r>
+    </w:p>
+    <w:p>
+      <w:pPr>
+        <w:pStyle w:val="Compact"/>
+        <w:numPr>
+          <w:ilvl w:val="0"/>
+          <w:numId w:val="1001"/>
+        </w:numPr>
+      </w:pPr>
+      <w:r>
+        <w:t xml:space="preserve">Built automated R Markdown pipelines generating hundreds of Tables, Figures, and Listings (TFLs) to support trial accuracy assessments and regulatory reporting.</w:t>
+      </w:r>
+    </w:p>
+    <w:p>
+      <w:pPr>
+        <w:pStyle w:val="Compact"/>
+        <w:numPr>
+          <w:ilvl w:val="0"/>
+          <w:numId w:val="1001"/>
+        </w:numPr>
+      </w:pPr>
+      <w:r>
+        <w:t xml:space="preserve">Developed and documented derived variables under CDISC standards (SDTM, ADaM, CDASH) with Git/GitLab collaboration and AWS S3 data management.</w:t>
+      </w:r>
+    </w:p>
+    <w:p>
+      <w:pPr>
+        <w:pStyle w:val="Compact"/>
+        <w:numPr>
+          <w:ilvl w:val="0"/>
+          <w:numId w:val="1001"/>
+        </w:numPr>
+      </w:pPr>
+      <w:r>
+        <w:t xml:space="preserve">Created an R Shiny app to visualize cancer screening timelines and key events leading to diagnosis.</w:t>
+      </w:r>
+    </w:p>
+    <w:p>
+      <w:pPr>
+        <w:pStyle w:val="Compact"/>
+        <w:numPr>
+          <w:ilvl w:val="0"/>
+          <w:numId w:val="1001"/>
+        </w:numPr>
+      </w:pPr>
+      <w:r>
+        <w:t xml:space="preserve">Provided statistical programming support for data cleaning, database locks, SAP-driven analyses, and exploratory investigations.</w:t>
+      </w:r>
+    </w:p>
+    <w:p>
+      <w:pPr>
+        <w:pStyle w:val="Compact"/>
+        <w:numPr>
+          <w:ilvl w:val="0"/>
+          <w:numId w:val="1001"/>
+        </w:numPr>
+      </w:pPr>
+      <w:r>
+        <w:t xml:space="preserve">Partnered with biostatisticians to translate SAPs into analysis specifications and reusable code.</w:t>
+      </w:r>
+    </w:p>
+    <w:p>
+      <w:pPr>
+        <w:pStyle w:val="Compact"/>
+        <w:numPr>
+          <w:ilvl w:val="0"/>
+          <w:numId w:val="1001"/>
+        </w:numPr>
+      </w:pPr>
+      <w:r>
+        <w:t xml:space="preserve">Built reproducible pipelines with unit tests and a shared code library to ensure audit-ready, backward-compatible outputs.</w:t>
       </w:r>
     </w:p>
     <w:bookmarkEnd w:id="14"/>
     <w:bookmarkEnd w:id="15"/>
-    <w:bookmarkStart w:id="18" w:name="senior-data-scientist"/>
+    <w:bookmarkStart w:id="18" w:name="reporting-analyst"/>
     <w:p>
       <w:pPr>
         <w:pStyle w:val="Heading3"/>
       </w:pPr>
       <w:r>
-        <w:t xml:space="preserve">Senior Data Scientist</w:t>
-      </w:r>
-    </w:p>
-    <w:bookmarkStart w:id="16" w:name="grail"/>
+        <w:t xml:space="preserve">Reporting Analyst</w:t>
+      </w:r>
+    </w:p>
+    <w:bookmarkStart w:id="16" w:name="hour-home-care"/>
     <w:p>
       <w:pPr>
         <w:pStyle w:val="Heading4"/>
       </w:pPr>
       <w:r>
-        <w:t xml:space="preserve">GRAIL</w:t>
+        <w:t xml:space="preserve">24 Hour Home Care</w:t>
       </w:r>
     </w:p>
     <w:bookmarkEnd w:id="16"/>
-    <w:bookmarkStart w:id="17" w:name="menlo-park-ca"/>
+    <w:bookmarkStart w:id="17" w:name="el-segundo-ca"/>
     <w:p>
       <w:pPr>
         <w:pStyle w:val="Heading4"/>
       </w:pPr>
       <w:r>
-        <w:t xml:space="preserve">Menlo Park, CA</w:t>
+        <w:t xml:space="preserve">El Segundo, CA</w:t>
       </w:r>
     </w:p>
     <w:p>
@@ -173,7 +245,7 @@
         <w:pStyle w:val="FirstParagraph"/>
       </w:pPr>
       <w:r>
-        <w:t xml:space="preserve">February 2021 - August 2024</w:t>
+        <w:t xml:space="preserve">April 2020 - January 2021</w:t>
       </w:r>
     </w:p>
     <w:p>
@@ -185,7 +257,7 @@
         </w:numPr>
       </w:pPr>
       <w:r>
-        <w:t xml:space="preserve">Authored and maintained multiple production R packages used company-wide for clinical trial analysis, validation, and reporting.</w:t>
+        <w:t xml:space="preserve">Automated weekly accounts receivable aging report in R with HTML/CSS email delivery, saving ~5 hours per week.</w:t>
       </w:r>
     </w:p>
     <w:p>
@@ -197,7 +269,7 @@
         </w:numPr>
       </w:pPr>
       <w:r>
-        <w:t xml:space="preserve">Built automated R Markdown pipelines generating hundreds of Tables, Figures, and Listings (TFLs) to support trial accuracy assessments and regulatory reporting.</w:t>
+        <w:t xml:space="preserve">Built ad hoc dashboards and data visualizations to support leadership requests.</w:t>
       </w:r>
     </w:p>
     <w:p>
@@ -209,7 +281,7 @@
         </w:numPr>
       </w:pPr>
       <w:r>
-        <w:t xml:space="preserve">Developed and documented derived variables under CDISC standards (SDTM, ADaM, CDASH) with Git/GitLab collaboration and AWS S3 data management.</w:t>
+        <w:t xml:space="preserve">Served as analytics liaison across teams to align reporting needs and delivery.</w:t>
       </w:r>
     </w:p>
     <w:p>
@@ -221,73 +293,37 @@
         </w:numPr>
       </w:pPr>
       <w:r>
-        <w:t xml:space="preserve">Created an R Shiny app to visualize cancer screening timelines and key events leading to diagnosis.</w:t>
-      </w:r>
-    </w:p>
-    <w:p>
-      <w:pPr>
-        <w:pStyle w:val="Compact"/>
-        <w:numPr>
-          <w:ilvl w:val="0"/>
-          <w:numId w:val="1002"/>
-        </w:numPr>
-      </w:pPr>
-      <w:r>
-        <w:t xml:space="preserve">Provided statistical programming support for data cleaning, database locks, SAP-driven analyses, and exploratory investigations.</w:t>
-      </w:r>
-    </w:p>
-    <w:p>
-      <w:pPr>
-        <w:pStyle w:val="Compact"/>
-        <w:numPr>
-          <w:ilvl w:val="0"/>
-          <w:numId w:val="1002"/>
-        </w:numPr>
-      </w:pPr>
-      <w:r>
-        <w:t xml:space="preserve">Partnered with biostatisticians to translate SAPs into analysis specifications and reusable code.</w:t>
-      </w:r>
-    </w:p>
-    <w:p>
-      <w:pPr>
-        <w:pStyle w:val="Compact"/>
-        <w:numPr>
-          <w:ilvl w:val="0"/>
-          <w:numId w:val="1002"/>
-        </w:numPr>
-      </w:pPr>
-      <w:r>
-        <w:t xml:space="preserve">Built reproducible pipelines with unit tests and a shared code library to ensure audit-ready, backward-compatible outputs.</w:t>
+        <w:t xml:space="preserve">Automated batch invoice emails and Azure Web App exports, reducing manual effort across teams.</w:t>
       </w:r>
     </w:p>
     <w:bookmarkEnd w:id="17"/>
     <w:bookmarkEnd w:id="18"/>
-    <w:bookmarkStart w:id="21" w:name="reporting-analyst"/>
+    <w:bookmarkStart w:id="21" w:name="actuarial-analyst"/>
     <w:p>
       <w:pPr>
         <w:pStyle w:val="Heading3"/>
       </w:pPr>
       <w:r>
-        <w:t xml:space="preserve">Reporting Analyst</w:t>
-      </w:r>
-    </w:p>
-    <w:bookmarkStart w:id="19" w:name="hour-home-care"/>
+        <w:t xml:space="preserve">Actuarial Analyst</w:t>
+      </w:r>
+    </w:p>
+    <w:bookmarkStart w:id="19" w:name="hmsa"/>
     <w:p>
       <w:pPr>
         <w:pStyle w:val="Heading4"/>
       </w:pPr>
       <w:r>
-        <w:t xml:space="preserve">24 Hour Home Care</w:t>
+        <w:t xml:space="preserve">HMSA</w:t>
       </w:r>
     </w:p>
     <w:bookmarkEnd w:id="19"/>
-    <w:bookmarkStart w:id="20" w:name="el-segundo-ca"/>
+    <w:bookmarkStart w:id="20" w:name="honolulu-hi"/>
     <w:p>
       <w:pPr>
         <w:pStyle w:val="Heading4"/>
       </w:pPr>
       <w:r>
-        <w:t xml:space="preserve">El Segundo, CA</w:t>
+        <w:t xml:space="preserve">Honolulu, HI</w:t>
       </w:r>
     </w:p>
     <w:p>
@@ -295,7 +331,7 @@
         <w:pStyle w:val="FirstParagraph"/>
       </w:pPr>
       <w:r>
-        <w:t xml:space="preserve">April 2020 - January 2021</w:t>
+        <w:t xml:space="preserve">January 2019 - March 2020</w:t>
       </w:r>
     </w:p>
     <w:p>
@@ -307,7 +343,7 @@
         </w:numPr>
       </w:pPr>
       <w:r>
-        <w:t xml:space="preserve">Automated weekly accounts receivable aging report in R with HTML/CSS email delivery, saving ~5 hours per week.</w:t>
+        <w:t xml:space="preserve">Automated CRG band renewal in R, reducing runtime from 8 hours to under 1 minute.</w:t>
       </w:r>
     </w:p>
     <w:p>
@@ -319,7 +355,7 @@
         </w:numPr>
       </w:pPr>
       <w:r>
-        <w:t xml:space="preserve">Built ad hoc dashboards and data visualizations to support leadership requests.</w:t>
+        <w:t xml:space="preserve">Automated demographic and plan risk factor workflows and forecasting models with Excel/R integration.</w:t>
       </w:r>
     </w:p>
     <w:p>
@@ -331,7 +367,7 @@
         </w:numPr>
       </w:pPr>
       <w:r>
-        <w:t xml:space="preserve">Served as analytics liaison across teams to align reporting needs and delivery.</w:t>
+        <w:t xml:space="preserve">Automated CRG proposal and mental health parity processes; documented methods and led stakeholder walkthroughs.</w:t>
       </w:r>
     </w:p>
     <w:p>
@@ -343,46 +379,43 @@
         </w:numPr>
       </w:pPr>
       <w:r>
-        <w:t xml:space="preserve">Automated batch invoice emails and Azure Web App exports, reducing manual effort across teams.</w:t>
+        <w:t xml:space="preserve">Fit empirical distributions using KS tests and MLE for actuarial modeling.</w:t>
       </w:r>
     </w:p>
     <w:bookmarkEnd w:id="20"/>
     <w:bookmarkEnd w:id="21"/>
-    <w:bookmarkStart w:id="24" w:name="actuarial-analyst"/>
+    <w:bookmarkEnd w:id="22"/>
+    <w:bookmarkStart w:id="32" w:name="selected-projects"/>
+    <w:p>
+      <w:pPr>
+        <w:pStyle w:val="Heading2"/>
+      </w:pPr>
+      <w:r>
+        <w:t xml:space="preserve">Selected Projects</w:t>
+      </w:r>
+    </w:p>
+    <w:bookmarkStart w:id="25" w:name="personal-data-site"/>
     <w:p>
       <w:pPr>
         <w:pStyle w:val="Heading3"/>
       </w:pPr>
       <w:r>
-        <w:t xml:space="preserve">Actuarial Analyst</w:t>
-      </w:r>
-    </w:p>
-    <w:bookmarkStart w:id="22" w:name="hmsa"/>
+        <w:t xml:space="preserve">Personal Data Site</w:t>
+      </w:r>
+    </w:p>
+    <w:bookmarkStart w:id="24" w:name="cavandonohoe.github.io"/>
     <w:p>
       <w:pPr>
         <w:pStyle w:val="Heading4"/>
       </w:pPr>
-      <w:r>
-        <w:t xml:space="preserve">HMSA</w:t>
-      </w:r>
-    </w:p>
-    <w:bookmarkEnd w:id="22"/>
-    <w:bookmarkStart w:id="23" w:name="honolulu-hi"/>
-    <w:p>
-      <w:pPr>
-        <w:pStyle w:val="Heading4"/>
-      </w:pPr>
-      <w:r>
-        <w:t xml:space="preserve">Honolulu, HI</w:t>
-      </w:r>
-    </w:p>
-    <w:p>
-      <w:pPr>
-        <w:pStyle w:val="FirstParagraph"/>
-      </w:pPr>
-      <w:r>
-        <w:t xml:space="preserve">January 2019 - March 2020</w:t>
-      </w:r>
+      <w:hyperlink r:id="rId23">
+        <w:r>
+          <w:rPr>
+            <w:rStyle w:val="Hyperlink"/>
+          </w:rPr>
+          <w:t xml:space="preserve">cavandonohoe.github.io</w:t>
+        </w:r>
+      </w:hyperlink>
     </w:p>
     <w:p>
       <w:pPr>
@@ -393,7 +426,7 @@
         </w:numPr>
       </w:pPr>
       <w:r>
-        <w:t xml:space="preserve">Automated CRG band renewal in R, reducing runtime from 8 hours to under 1 minute.</w:t>
+        <w:t xml:space="preserve">Built 45+ GitHub Actions workflows that refresh datasets on a schedule (IMDb, S&amp;P 500, rental markets, box office)</w:t>
       </w:r>
     </w:p>
     <w:p>
@@ -405,7 +438,7 @@
         </w:numPr>
       </w:pPr>
       <w:r>
-        <w:t xml:space="preserve">Automated demographic and plan risk factor workflows and forecasting models with Excel/R integration.</w:t>
+        <w:t xml:space="preserve">Shipped 225+ merged PRs and 600+ commits through a CI-gated pull request workflow</w:t>
       </w:r>
     </w:p>
     <w:p>
@@ -417,7 +450,7 @@
         </w:numPr>
       </w:pPr>
       <w:r>
-        <w:t xml:space="preserve">Automated CRG proposal and mental health parity processes; documented methods and led stakeholder walkthroughs.</w:t>
+        <w:t xml:space="preserve">Gated every PR with lint, tests, typo and link checks, and Lighthouse/pa11y accessibility audits</w:t>
       </w:r>
     </w:p>
     <w:p>
@@ -429,56 +462,45 @@
         </w:numPr>
       </w:pPr>
       <w:r>
-        <w:t xml:space="preserve">Fit empirical distributions using KS tests and MLE for actuarial modeling.</w:t>
-      </w:r>
-    </w:p>
-    <w:bookmarkEnd w:id="23"/>
+        <w:t xml:space="preserve">Set up per-branch preview deploys with automatic pruning, Dependabot auto-merge, and failure alerts</w:t>
+      </w:r>
+    </w:p>
+    <w:p>
+      <w:pPr>
+        <w:pStyle w:val="Compact"/>
+        <w:numPr>
+          <w:ilvl w:val="0"/>
+          <w:numId w:val="1004"/>
+        </w:numPr>
+      </w:pPr>
+      <w:r>
+        <w:t xml:space="preserve">Resume rebuilds automatically from a Google Sheet, with live GitHub stats, through a scheduled workflow</w:t>
+      </w:r>
+    </w:p>
     <w:bookmarkEnd w:id="24"/>
     <w:bookmarkEnd w:id="25"/>
-    <w:bookmarkStart w:id="29" w:name="education"/>
-    <w:p>
-      <w:pPr>
-        <w:pStyle w:val="Heading2"/>
-      </w:pPr>
-      <w:r>
-        <w:t xml:space="preserve">Education</w:t>
-      </w:r>
-    </w:p>
-    <w:bookmarkStart w:id="28" w:name="bachelor-of-science"/>
+    <w:bookmarkStart w:id="28" w:name="rent-vs.-buy"/>
     <w:p>
       <w:pPr>
         <w:pStyle w:val="Heading3"/>
       </w:pPr>
       <w:r>
-        <w:t xml:space="preserve">Bachelor of Science</w:t>
-      </w:r>
-    </w:p>
-    <w:bookmarkStart w:id="26" w:name="university-of-california-irvine"/>
+        <w:t xml:space="preserve">Rent vs. Buy</w:t>
+      </w:r>
+    </w:p>
+    <w:bookmarkStart w:id="27" w:name="r-shiny-app"/>
     <w:p>
       <w:pPr>
         <w:pStyle w:val="Heading4"/>
       </w:pPr>
-      <w:r>
-        <w:t xml:space="preserve">University of California, Irvine</w:t>
-      </w:r>
-    </w:p>
-    <w:bookmarkEnd w:id="26"/>
-    <w:bookmarkStart w:id="27" w:name="irvine-ca"/>
-    <w:p>
-      <w:pPr>
-        <w:pStyle w:val="Heading4"/>
-      </w:pPr>
-      <w:r>
-        <w:t xml:space="preserve">Irvine, CA</w:t>
-      </w:r>
-    </w:p>
-    <w:p>
-      <w:pPr>
-        <w:pStyle w:val="FirstParagraph"/>
-      </w:pPr>
-      <w:r>
-        <w:t xml:space="preserve">2018</w:t>
-      </w:r>
+      <w:hyperlink r:id="rId26">
+        <w:r>
+          <w:rPr>
+            <w:rStyle w:val="Hyperlink"/>
+          </w:rPr>
+          <w:t xml:space="preserve">R Shiny app</w:t>
+        </w:r>
+      </w:hyperlink>
     </w:p>
     <w:p>
       <w:pPr>
@@ -489,7 +511,7 @@
         </w:numPr>
       </w:pPr>
       <w:r>
-        <w:t xml:space="preserve">Major in Mathematics</w:t>
+        <w:t xml:space="preserve">Interactive app comparing the long-run financial outcomes of renting vs. buying a home</w:t>
       </w:r>
     </w:p>
     <w:p>
@@ -501,22 +523,143 @@
         </w:numPr>
       </w:pPr>
       <w:r>
-        <w:t xml:space="preserve">Minor in Statistics</w:t>
+        <w:t xml:space="preserve">CI runs tests, then deploys automatically to shinyapps.io</w:t>
       </w:r>
     </w:p>
     <w:bookmarkEnd w:id="27"/>
     <w:bookmarkEnd w:id="28"/>
-    <w:bookmarkEnd w:id="29"/>
-    <w:bookmarkStart w:id="33" w:name="awards"/>
+    <w:bookmarkStart w:id="31" w:name="confederate-statues"/>
+    <w:p>
+      <w:pPr>
+        <w:pStyle w:val="Heading3"/>
+      </w:pPr>
+      <w:r>
+        <w:t xml:space="preserve">Confederate Statues</w:t>
+      </w:r>
+    </w:p>
+    <w:bookmarkStart w:id="30" w:name="github"/>
+    <w:p>
+      <w:pPr>
+        <w:pStyle w:val="Heading4"/>
+      </w:pPr>
+      <w:hyperlink r:id="rId29">
+        <w:r>
+          <w:rPr>
+            <w:rStyle w:val="Hyperlink"/>
+          </w:rPr>
+          <w:t xml:space="preserve">GitHub</w:t>
+        </w:r>
+      </w:hyperlink>
+    </w:p>
+    <w:p>
+      <w:pPr>
+        <w:pStyle w:val="Compact"/>
+        <w:numPr>
+          <w:ilvl w:val="0"/>
+          <w:numId w:val="1006"/>
+        </w:numPr>
+      </w:pPr>
+      <w:r>
+        <w:t xml:space="preserve">Scraped Wikipedia in R and Python to build a dataset of when Confederate statues were erected</w:t>
+      </w:r>
+    </w:p>
+    <w:p>
+      <w:pPr>
+        <w:pStyle w:val="Compact"/>
+        <w:numPr>
+          <w:ilvl w:val="0"/>
+          <w:numId w:val="1006"/>
+        </w:numPr>
+      </w:pPr>
+      <w:r>
+        <w:t xml:space="preserve">Data refreshes on a schedule, with CI and a Docker build for the service</w:t>
+      </w:r>
+    </w:p>
+    <w:bookmarkEnd w:id="30"/>
+    <w:bookmarkEnd w:id="31"/>
+    <w:bookmarkEnd w:id="32"/>
+    <w:bookmarkStart w:id="36" w:name="education"/>
     <w:p>
       <w:pPr>
         <w:pStyle w:val="Heading2"/>
       </w:pPr>
       <w:r>
+        <w:t xml:space="preserve">Education</w:t>
+      </w:r>
+    </w:p>
+    <w:bookmarkStart w:id="35" w:name="bachelor-of-science"/>
+    <w:p>
+      <w:pPr>
+        <w:pStyle w:val="Heading3"/>
+      </w:pPr>
+      <w:r>
+        <w:t xml:space="preserve">Bachelor of Science</w:t>
+      </w:r>
+    </w:p>
+    <w:bookmarkStart w:id="33" w:name="university-of-california-irvine"/>
+    <w:p>
+      <w:pPr>
+        <w:pStyle w:val="Heading4"/>
+      </w:pPr>
+      <w:r>
+        <w:t xml:space="preserve">University of California, Irvine</w:t>
+      </w:r>
+    </w:p>
+    <w:bookmarkEnd w:id="33"/>
+    <w:bookmarkStart w:id="34" w:name="irvine-ca"/>
+    <w:p>
+      <w:pPr>
+        <w:pStyle w:val="Heading4"/>
+      </w:pPr>
+      <w:r>
+        <w:t xml:space="preserve">Irvine, CA</w:t>
+      </w:r>
+    </w:p>
+    <w:p>
+      <w:pPr>
+        <w:pStyle w:val="FirstParagraph"/>
+      </w:pPr>
+      <w:r>
+        <w:t xml:space="preserve">2018</w:t>
+      </w:r>
+    </w:p>
+    <w:p>
+      <w:pPr>
+        <w:pStyle w:val="Compact"/>
+        <w:numPr>
+          <w:ilvl w:val="0"/>
+          <w:numId w:val="1007"/>
+        </w:numPr>
+      </w:pPr>
+      <w:r>
+        <w:t xml:space="preserve">Major in Mathematics</w:t>
+      </w:r>
+    </w:p>
+    <w:p>
+      <w:pPr>
+        <w:pStyle w:val="Compact"/>
+        <w:numPr>
+          <w:ilvl w:val="0"/>
+          <w:numId w:val="1007"/>
+        </w:numPr>
+      </w:pPr>
+      <w:r>
+        <w:t xml:space="preserve">Minor in Statistics</w:t>
+      </w:r>
+    </w:p>
+    <w:bookmarkEnd w:id="34"/>
+    <w:bookmarkEnd w:id="35"/>
+    <w:bookmarkEnd w:id="36"/>
+    <w:bookmarkStart w:id="40" w:name="awards"/>
+    <w:p>
+      <w:pPr>
+        <w:pStyle w:val="Heading2"/>
+      </w:pPr>
+      <w:r>
         <w:t xml:space="preserve">Awards</w:t>
       </w:r>
     </w:p>
-    <w:bookmarkStart w:id="32" w:name="X2250b0ba64101f53b5fdfff6ab9a85e023ab2b4"/>
+    <w:bookmarkStart w:id="39" w:name="X2250b0ba64101f53b5fdfff6ab9a85e023ab2b4"/>
     <w:p>
       <w:pPr>
         <w:pStyle w:val="Heading3"/>
@@ -524,7 +667,7 @@
       <w:r>
         <w:t xml:space="preserve">BAS UCLA Case Competition Finalist (</w:t>
       </w:r>
-      <w:hyperlink r:id="rId30">
+      <w:hyperlink r:id="rId37">
         <w:r>
           <w:rPr>
             <w:rStyle w:val="Hyperlink"/>
@@ -541,7 +684,7 @@
       <w:r>
         <w:t xml:space="preserve"> </w:t>
       </w:r>
-      <w:hyperlink r:id="rId31">
+      <w:hyperlink r:id="rId38">
         <w:r>
           <w:rPr>
             <w:rStyle w:val="Hyperlink"/>
@@ -553,9 +696,9 @@
         <w:t xml:space="preserve">)</w:t>
       </w:r>
     </w:p>
-    <w:bookmarkEnd w:id="32"/>
-    <w:bookmarkEnd w:id="33"/>
-    <w:bookmarkStart w:id="35" w:name="credentials"/>
+    <w:bookmarkEnd w:id="39"/>
+    <w:bookmarkEnd w:id="40"/>
+    <w:bookmarkStart w:id="42" w:name="credentials"/>
     <w:p>
       <w:pPr>
         <w:pStyle w:val="Heading2"/>
@@ -564,7 +707,7 @@
         <w:t xml:space="preserve">Credentials</w:t>
       </w:r>
     </w:p>
-    <w:bookmarkStart w:id="34" w:name="passed-3-actuarial-exams-exam-p-fm-srm"/>
+    <w:bookmarkStart w:id="41" w:name="passed-3-actuarial-exams-exam-p-fm-srm"/>
     <w:p>
       <w:pPr>
         <w:pStyle w:val="Heading3"/>
@@ -573,9 +716,9 @@
         <w:t xml:space="preserve">Passed 3 Actuarial Exams (Exam P, FM, SRM)</w:t>
       </w:r>
     </w:p>
-    <w:bookmarkEnd w:id="34"/>
-    <w:bookmarkEnd w:id="35"/>
-    <w:bookmarkStart w:id="36" w:name="skills"/>
+    <w:bookmarkEnd w:id="41"/>
+    <w:bookmarkEnd w:id="42"/>
+    <w:bookmarkStart w:id="43" w:name="skills"/>
     <w:p>
       <w:pPr>
         <w:pStyle w:val="Heading2"/>
@@ -588,18 +731,18 @@
       <w:pPr>
         <w:numPr>
           <w:ilvl w:val="0"/>
-          <w:numId w:val="1006"/>
+          <w:numId w:val="1008"/>
         </w:numPr>
       </w:pPr>
       <w:r>
-        <w:t xml:space="preserve">R: tidyverse, data.table, ggplot2, Shiny, R Markdown, package development, unit testing, automation, resampling (bootstrap/jackknife)</w:t>
+        <w:t xml:space="preserve">R: tidyverse, data.table, ggplot2, Shiny, R Markdown, package development, unit testing, resampling</w:t>
       </w:r>
     </w:p>
     <w:p>
       <w:pPr>
         <w:numPr>
           <w:ilvl w:val="0"/>
-          <w:numId w:val="1006"/>
+          <w:numId w:val="1008"/>
         </w:numPr>
       </w:pPr>
       <w:r>
@@ -610,36 +753,47 @@
       <w:pPr>
         <w:numPr>
           <w:ilvl w:val="0"/>
-          <w:numId w:val="1006"/>
+          <w:numId w:val="1008"/>
         </w:numPr>
       </w:pPr>
       <w:r>
-        <w:t xml:space="preserve">Databases: SQL (PostgreSQL)</w:t>
+        <w:t xml:space="preserve">Languages &amp; Data: Python, SQL (PostgreSQL), AWS S3</w:t>
       </w:r>
     </w:p>
     <w:p>
       <w:pPr>
         <w:numPr>
           <w:ilvl w:val="0"/>
-          <w:numId w:val="1006"/>
+          <w:numId w:val="1008"/>
         </w:numPr>
       </w:pPr>
       <w:r>
-        <w:t xml:space="preserve">Developer Tooling: Git/GitLab, CI workflows, AWS S3, AI-assisted development (Cursor, GitHub Copilot, Gemini, Codex) with full manual review and validation</w:t>
+        <w:t xml:space="preserve">Git &amp; CI/CD: Git, GitHub, GitLab, GitHub Actions (scheduled pipelines, test/lint gates, preview deploys), GitLab CI, Docker</w:t>
       </w:r>
     </w:p>
     <w:p>
       <w:pPr>
         <w:numPr>
           <w:ilvl w:val="0"/>
-          <w:numId w:val="1006"/>
+          <w:numId w:val="1008"/>
         </w:numPr>
       </w:pPr>
       <w:r>
-        <w:t xml:space="preserve">Excel: Advanced formulas, automation, VBA</w:t>
-      </w:r>
-    </w:p>
-    <w:bookmarkEnd w:id="36"/>
+        <w:t xml:space="preserve">AI-assisted development (Cursor, Copilot, Codex) with full manual review</w:t>
+      </w:r>
+    </w:p>
+    <w:p>
+      <w:pPr>
+        <w:numPr>
+          <w:ilvl w:val="0"/>
+          <w:numId w:val="1008"/>
+        </w:numPr>
+      </w:pPr>
+      <w:r>
+        <w:t xml:space="preserve">Excel: Advanced formulas, VBA</w:t>
+      </w:r>
+    </w:p>
+    <w:bookmarkEnd w:id="43"/>
     <w:sectPr>
       <w:pgSz w:h="15840" w:w="12240"/>
       <w:pgMar w:bottom="423" w:footer="720" w:gutter="0" w:header="720" w:left="1440" w:right="1440" w:top="1134"/>
@@ -2506,6 +2660,12 @@
     <w:abstractNumId w:val="991"/>
   </w:num>
   <w:num w:numId="1006">
+    <w:abstractNumId w:val="991"/>
+  </w:num>
+  <w:num w:numId="1007">
+    <w:abstractNumId w:val="991"/>
+  </w:num>
+  <w:num w:numId="1008">
     <w:abstractNumId w:val="991"/>
   </w:num>
 </w:numbering>

</xml_diff>

<commit_message>
Show Personal Data Site history since 2020 on CV
</commit_message>
<xml_diff>
--- a/cv_doc.docx
+++ b/cv_doc.docx
@@ -416,6 +416,18 @@
           <w:t xml:space="preserve">cavandonohoe.github.io</w:t>
         </w:r>
       </w:hyperlink>
+    </w:p>
+    <w:p>
+      <w:pPr>
+        <w:pStyle w:val="Compact"/>
+        <w:numPr>
+          <w:ilvl w:val="0"/>
+          <w:numId w:val="1004"/>
+        </w:numPr>
+      </w:pPr>
+      <w:r>
+        <w:t xml:space="preserve">Hand-coded and maintained since 2020, with 280+ commits of R Markdown analysis, web scraping, and data visualization before agentic coding tools existed</w:t>
+      </w:r>
     </w:p>
     <w:p>
       <w:pPr>

</xml_diff>

<commit_message>
Show Personal Data Site history since 2020 on CV (#319)
* Show Personal Data Site history since 2020 on CV

* Re-render CV after merging main

* Fix CV sidebar overflow clipping the disclaimer
</commit_message>
<xml_diff>
--- a/cv_doc.docx
+++ b/cv_doc.docx
@@ -416,6 +416,18 @@
           <w:t xml:space="preserve">cavandonohoe.github.io</w:t>
         </w:r>
       </w:hyperlink>
+    </w:p>
+    <w:p>
+      <w:pPr>
+        <w:pStyle w:val="Compact"/>
+        <w:numPr>
+          <w:ilvl w:val="0"/>
+          <w:numId w:val="1004"/>
+        </w:numPr>
+      </w:pPr>
+      <w:r>
+        <w:t xml:space="preserve">Hand-coded and maintained since 2020, with 280+ commits of R Markdown analysis, web scraping, and data visualization before agentic coding tools existed</w:t>
+      </w:r>
     </w:p>
     <w:p>
       <w:pPr>

</xml_diff>